<commit_message>
docs(backlog): v11 — correction coquille versionnement ligne de fin
</commit_message>
<xml_diff>
--- a/docs/backlogs/AnarBib-Backlog-2026-05-21-v11.docx
+++ b/docs/backlogs/AnarBib-Backlog-2026-05-21-v11.docx
@@ -27,7 +27,7 @@
           <w:iCs/>
           <w:color w:val="6B7280"/>
         </w:rPr>
-        <w:t>Backlog unifié — v10 (21/05) actualisé après clôture du sous-paquet R.4 du chantier #110 migration mail — bascule MAIL_PROVIDER=resend effectuée le 21/05</w:t>
+        <w:t>Backlog unifié — v11 (21/05) actualisé après clôture du sous-paquet R.4 du chantier #110 migration mail — bascule MAIL_PROVIDER=resend effectuée le 21/05</w:t>
       </w:r>
     </w:p>
     <w:p>
@@ -479,6 +479,7 @@
         <w:pStyle w:val="Titre1"/>
       </w:pPr>
       <w:r>
+        <w:lastRenderedPageBreak/>
         <w:t>B. Convention de scoring et estimation</w:t>
       </w:r>
     </w:p>
@@ -487,7 +488,6 @@
         <w:spacing w:after="120"/>
       </w:pPr>
       <w:r>
-        <w:lastRenderedPageBreak/>
         <w:t>Score = Importance politique (1-5) + Effort/Urgence inverse (1-3) → de 2 à 8 selon v6 historique. Pour cohérence avec v15, on conserve la grille étendue (max 18 = critique).</w:t>
       </w:r>
     </w:p>
@@ -615,12 +615,6 @@
         <w:gridCol w:w="1166"/>
       </w:tblGrid>
       <w:tr>
-        <w:tblPrEx>
-          <w:tblCellMar>
-            <w:top w:w="0" w:type="dxa"/>
-            <w:bottom w:w="0" w:type="dxa"/>
-          </w:tblCellMar>
-        </w:tblPrEx>
         <w:trPr>
           <w:tblHeader/>
         </w:trPr>
@@ -806,12 +800,6 @@
         </w:tc>
       </w:tr>
       <w:tr>
-        <w:tblPrEx>
-          <w:tblCellMar>
-            <w:top w:w="0" w:type="dxa"/>
-            <w:bottom w:w="0" w:type="dxa"/>
-          </w:tblCellMar>
-        </w:tblPrEx>
         <w:tc>
           <w:tcPr>
             <w:tcW w:w="600" w:type="dxa"/>
@@ -986,12 +974,6 @@
         </w:tc>
       </w:tr>
       <w:tr>
-        <w:tblPrEx>
-          <w:tblCellMar>
-            <w:top w:w="0" w:type="dxa"/>
-            <w:bottom w:w="0" w:type="dxa"/>
-          </w:tblCellMar>
-        </w:tblPrEx>
         <w:tc>
           <w:tcPr>
             <w:tcW w:w="600" w:type="dxa"/>
@@ -1166,12 +1148,6 @@
         </w:tc>
       </w:tr>
       <w:tr>
-        <w:tblPrEx>
-          <w:tblCellMar>
-            <w:top w:w="0" w:type="dxa"/>
-            <w:bottom w:w="0" w:type="dxa"/>
-          </w:tblCellMar>
-        </w:tblPrEx>
         <w:tc>
           <w:tcPr>
             <w:tcW w:w="600" w:type="dxa"/>
@@ -1346,12 +1322,6 @@
         </w:tc>
       </w:tr>
       <w:tr>
-        <w:tblPrEx>
-          <w:tblCellMar>
-            <w:top w:w="0" w:type="dxa"/>
-            <w:bottom w:w="0" w:type="dxa"/>
-          </w:tblCellMar>
-        </w:tblPrEx>
         <w:tc>
           <w:tcPr>
             <w:tcW w:w="600" w:type="dxa"/>
@@ -1526,12 +1496,6 @@
         </w:tc>
       </w:tr>
       <w:tr>
-        <w:tblPrEx>
-          <w:tblCellMar>
-            <w:top w:w="0" w:type="dxa"/>
-            <w:bottom w:w="0" w:type="dxa"/>
-          </w:tblCellMar>
-        </w:tblPrEx>
         <w:tc>
           <w:tcPr>
             <w:tcW w:w="600" w:type="dxa"/>
@@ -1706,12 +1670,6 @@
         </w:tc>
       </w:tr>
       <w:tr>
-        <w:tblPrEx>
-          <w:tblCellMar>
-            <w:top w:w="0" w:type="dxa"/>
-            <w:bottom w:w="0" w:type="dxa"/>
-          </w:tblCellMar>
-        </w:tblPrEx>
         <w:tc>
           <w:tcPr>
             <w:tcW w:w="600" w:type="dxa"/>
@@ -1886,12 +1844,6 @@
         </w:tc>
       </w:tr>
       <w:tr>
-        <w:tblPrEx>
-          <w:tblCellMar>
-            <w:top w:w="0" w:type="dxa"/>
-            <w:bottom w:w="0" w:type="dxa"/>
-          </w:tblCellMar>
-        </w:tblPrEx>
         <w:tc>
           <w:tcPr>
             <w:tcW w:w="600" w:type="dxa"/>
@@ -2066,12 +2018,6 @@
         </w:tc>
       </w:tr>
       <w:tr>
-        <w:tblPrEx>
-          <w:tblCellMar>
-            <w:top w:w="0" w:type="dxa"/>
-            <w:bottom w:w="0" w:type="dxa"/>
-          </w:tblCellMar>
-        </w:tblPrEx>
         <w:tc>
           <w:tcPr>
             <w:tcW w:w="600" w:type="dxa"/>
@@ -2246,12 +2192,6 @@
         </w:tc>
       </w:tr>
       <w:tr>
-        <w:tblPrEx>
-          <w:tblCellMar>
-            <w:top w:w="0" w:type="dxa"/>
-            <w:bottom w:w="0" w:type="dxa"/>
-          </w:tblCellMar>
-        </w:tblPrEx>
         <w:tc>
           <w:tcPr>
             <w:tcW w:w="600" w:type="dxa"/>
@@ -2432,12 +2372,6 @@
         </w:tc>
       </w:tr>
       <w:tr>
-        <w:tblPrEx>
-          <w:tblCellMar>
-            <w:top w:w="0" w:type="dxa"/>
-            <w:bottom w:w="0" w:type="dxa"/>
-          </w:tblCellMar>
-        </w:tblPrEx>
         <w:tc>
           <w:tcPr>
             <w:tcW w:w="600" w:type="dxa"/>
@@ -2612,12 +2546,6 @@
         </w:tc>
       </w:tr>
       <w:tr>
-        <w:tblPrEx>
-          <w:tblCellMar>
-            <w:top w:w="0" w:type="dxa"/>
-            <w:bottom w:w="0" w:type="dxa"/>
-          </w:tblCellMar>
-        </w:tblPrEx>
         <w:tc>
           <w:tcPr>
             <w:tcW w:w="600" w:type="dxa"/>
@@ -2792,12 +2720,6 @@
         </w:tc>
       </w:tr>
       <w:tr>
-        <w:tblPrEx>
-          <w:tblCellMar>
-            <w:top w:w="0" w:type="dxa"/>
-            <w:bottom w:w="0" w:type="dxa"/>
-          </w:tblCellMar>
-        </w:tblPrEx>
         <w:tc>
           <w:tcPr>
             <w:tcW w:w="600" w:type="dxa"/>
@@ -2972,12 +2894,6 @@
         </w:tc>
       </w:tr>
       <w:tr>
-        <w:tblPrEx>
-          <w:tblCellMar>
-            <w:top w:w="0" w:type="dxa"/>
-            <w:bottom w:w="0" w:type="dxa"/>
-          </w:tblCellMar>
-        </w:tblPrEx>
         <w:tc>
           <w:tcPr>
             <w:tcW w:w="600" w:type="dxa"/>
@@ -3152,12 +3068,6 @@
         </w:tc>
       </w:tr>
       <w:tr>
-        <w:tblPrEx>
-          <w:tblCellMar>
-            <w:top w:w="0" w:type="dxa"/>
-            <w:bottom w:w="0" w:type="dxa"/>
-          </w:tblCellMar>
-        </w:tblPrEx>
         <w:tc>
           <w:tcPr>
             <w:tcW w:w="600" w:type="dxa"/>
@@ -3338,12 +3248,6 @@
         </w:tc>
       </w:tr>
       <w:tr>
-        <w:tblPrEx>
-          <w:tblCellMar>
-            <w:top w:w="0" w:type="dxa"/>
-            <w:bottom w:w="0" w:type="dxa"/>
-          </w:tblCellMar>
-        </w:tblPrEx>
         <w:tc>
           <w:tcPr>
             <w:tcW w:w="600" w:type="dxa"/>
@@ -3518,12 +3422,6 @@
         </w:tc>
       </w:tr>
       <w:tr>
-        <w:tblPrEx>
-          <w:tblCellMar>
-            <w:top w:w="0" w:type="dxa"/>
-            <w:bottom w:w="0" w:type="dxa"/>
-          </w:tblCellMar>
-        </w:tblPrEx>
         <w:tc>
           <w:tcPr>
             <w:tcW w:w="600" w:type="dxa"/>
@@ -3698,12 +3596,6 @@
         </w:tc>
       </w:tr>
       <w:tr>
-        <w:tblPrEx>
-          <w:tblCellMar>
-            <w:top w:w="0" w:type="dxa"/>
-            <w:bottom w:w="0" w:type="dxa"/>
-          </w:tblCellMar>
-        </w:tblPrEx>
         <w:tc>
           <w:tcPr>
             <w:tcW w:w="600" w:type="dxa"/>
@@ -3878,12 +3770,6 @@
         </w:tc>
       </w:tr>
       <w:tr>
-        <w:tblPrEx>
-          <w:tblCellMar>
-            <w:top w:w="0" w:type="dxa"/>
-            <w:bottom w:w="0" w:type="dxa"/>
-          </w:tblCellMar>
-        </w:tblPrEx>
         <w:tc>
           <w:tcPr>
             <w:tcW w:w="600" w:type="dxa"/>
@@ -4058,12 +3944,6 @@
         </w:tc>
       </w:tr>
       <w:tr>
-        <w:tblPrEx>
-          <w:tblCellMar>
-            <w:top w:w="0" w:type="dxa"/>
-            <w:bottom w:w="0" w:type="dxa"/>
-          </w:tblCellMar>
-        </w:tblPrEx>
         <w:tc>
           <w:tcPr>
             <w:tcW w:w="600" w:type="dxa"/>
@@ -4239,12 +4119,6 @@
         </w:tc>
       </w:tr>
       <w:tr>
-        <w:tblPrEx>
-          <w:tblCellMar>
-            <w:top w:w="0" w:type="dxa"/>
-            <w:bottom w:w="0" w:type="dxa"/>
-          </w:tblCellMar>
-        </w:tblPrEx>
         <w:tc>
           <w:tcPr>
             <w:tcW w:w="600" w:type="dxa"/>
@@ -4419,12 +4293,6 @@
         </w:tc>
       </w:tr>
       <w:tr>
-        <w:tblPrEx>
-          <w:tblCellMar>
-            <w:top w:w="0" w:type="dxa"/>
-            <w:bottom w:w="0" w:type="dxa"/>
-          </w:tblCellMar>
-        </w:tblPrEx>
         <w:tc>
           <w:tcPr>
             <w:tcW w:w="600" w:type="dxa"/>
@@ -4599,12 +4467,6 @@
         </w:tc>
       </w:tr>
       <w:tr>
-        <w:tblPrEx>
-          <w:tblCellMar>
-            <w:top w:w="0" w:type="dxa"/>
-            <w:bottom w:w="0" w:type="dxa"/>
-          </w:tblCellMar>
-        </w:tblPrEx>
         <w:tc>
           <w:tcPr>
             <w:tcW w:w="600" w:type="dxa"/>
@@ -4779,12 +4641,6 @@
         </w:tc>
       </w:tr>
       <w:tr>
-        <w:tblPrEx>
-          <w:tblCellMar>
-            <w:top w:w="0" w:type="dxa"/>
-            <w:bottom w:w="0" w:type="dxa"/>
-          </w:tblCellMar>
-        </w:tblPrEx>
         <w:tc>
           <w:tcPr>
             <w:tcW w:w="600" w:type="dxa"/>
@@ -4959,12 +4815,6 @@
         </w:tc>
       </w:tr>
       <w:tr>
-        <w:tblPrEx>
-          <w:tblCellMar>
-            <w:top w:w="0" w:type="dxa"/>
-            <w:bottom w:w="0" w:type="dxa"/>
-          </w:tblCellMar>
-        </w:tblPrEx>
         <w:tc>
           <w:tcPr>
             <w:tcW w:w="600" w:type="dxa"/>
@@ -5139,12 +4989,6 @@
         </w:tc>
       </w:tr>
       <w:tr>
-        <w:tblPrEx>
-          <w:tblCellMar>
-            <w:top w:w="0" w:type="dxa"/>
-            <w:bottom w:w="0" w:type="dxa"/>
-          </w:tblCellMar>
-        </w:tblPrEx>
         <w:tc>
           <w:tcPr>
             <w:tcW w:w="600" w:type="dxa"/>
@@ -5319,12 +5163,6 @@
         </w:tc>
       </w:tr>
       <w:tr>
-        <w:tblPrEx>
-          <w:tblCellMar>
-            <w:top w:w="0" w:type="dxa"/>
-            <w:bottom w:w="0" w:type="dxa"/>
-          </w:tblCellMar>
-        </w:tblPrEx>
         <w:tc>
           <w:tcPr>
             <w:tcW w:w="600" w:type="dxa"/>
@@ -5505,12 +5343,6 @@
         </w:tc>
       </w:tr>
       <w:tr>
-        <w:tblPrEx>
-          <w:tblCellMar>
-            <w:top w:w="0" w:type="dxa"/>
-            <w:bottom w:w="0" w:type="dxa"/>
-          </w:tblCellMar>
-        </w:tblPrEx>
         <w:tc>
           <w:tcPr>
             <w:tcW w:w="600" w:type="dxa"/>
@@ -5685,12 +5517,6 @@
         </w:tc>
       </w:tr>
       <w:tr>
-        <w:tblPrEx>
-          <w:tblCellMar>
-            <w:top w:w="0" w:type="dxa"/>
-            <w:bottom w:w="0" w:type="dxa"/>
-          </w:tblCellMar>
-        </w:tblPrEx>
         <w:tc>
           <w:tcPr>
             <w:tcW w:w="600" w:type="dxa"/>
@@ -5865,12 +5691,6 @@
         </w:tc>
       </w:tr>
       <w:tr>
-        <w:tblPrEx>
-          <w:tblCellMar>
-            <w:top w:w="0" w:type="dxa"/>
-            <w:bottom w:w="0" w:type="dxa"/>
-          </w:tblCellMar>
-        </w:tblPrEx>
         <w:tc>
           <w:tcPr>
             <w:tcW w:w="600" w:type="dxa"/>
@@ -6045,12 +5865,6 @@
         </w:tc>
       </w:tr>
       <w:tr>
-        <w:tblPrEx>
-          <w:tblCellMar>
-            <w:top w:w="0" w:type="dxa"/>
-            <w:bottom w:w="0" w:type="dxa"/>
-          </w:tblCellMar>
-        </w:tblPrEx>
         <w:tc>
           <w:tcPr>
             <w:tcW w:w="600" w:type="dxa"/>
@@ -6225,12 +6039,6 @@
         </w:tc>
       </w:tr>
       <w:tr>
-        <w:tblPrEx>
-          <w:tblCellMar>
-            <w:top w:w="0" w:type="dxa"/>
-            <w:bottom w:w="0" w:type="dxa"/>
-          </w:tblCellMar>
-        </w:tblPrEx>
         <w:tc>
           <w:tcPr>
             <w:tcW w:w="600" w:type="dxa"/>
@@ -6411,12 +6219,6 @@
         </w:tc>
       </w:tr>
       <w:tr>
-        <w:tblPrEx>
-          <w:tblCellMar>
-            <w:top w:w="0" w:type="dxa"/>
-            <w:bottom w:w="0" w:type="dxa"/>
-          </w:tblCellMar>
-        </w:tblPrEx>
         <w:tc>
           <w:tcPr>
             <w:tcW w:w="600" w:type="dxa"/>
@@ -6591,12 +6393,6 @@
         </w:tc>
       </w:tr>
       <w:tr>
-        <w:tblPrEx>
-          <w:tblCellMar>
-            <w:top w:w="0" w:type="dxa"/>
-            <w:bottom w:w="0" w:type="dxa"/>
-          </w:tblCellMar>
-        </w:tblPrEx>
         <w:tc>
           <w:tcPr>
             <w:tcW w:w="600" w:type="dxa"/>
@@ -6771,12 +6567,6 @@
         </w:tc>
       </w:tr>
       <w:tr>
-        <w:tblPrEx>
-          <w:tblCellMar>
-            <w:top w:w="0" w:type="dxa"/>
-            <w:bottom w:w="0" w:type="dxa"/>
-          </w:tblCellMar>
-        </w:tblPrEx>
         <w:tc>
           <w:tcPr>
             <w:tcW w:w="600" w:type="dxa"/>
@@ -6951,12 +6741,6 @@
         </w:tc>
       </w:tr>
       <w:tr>
-        <w:tblPrEx>
-          <w:tblCellMar>
-            <w:top w:w="0" w:type="dxa"/>
-            <w:bottom w:w="0" w:type="dxa"/>
-          </w:tblCellMar>
-        </w:tblPrEx>
         <w:tc>
           <w:tcPr>
             <w:tcW w:w="600" w:type="dxa"/>
@@ -7131,12 +6915,6 @@
         </w:tc>
       </w:tr>
       <w:tr>
-        <w:tblPrEx>
-          <w:tblCellMar>
-            <w:top w:w="0" w:type="dxa"/>
-            <w:bottom w:w="0" w:type="dxa"/>
-          </w:tblCellMar>
-        </w:tblPrEx>
         <w:tc>
           <w:tcPr>
             <w:tcW w:w="600" w:type="dxa"/>
@@ -7311,12 +7089,6 @@
         </w:tc>
       </w:tr>
       <w:tr>
-        <w:tblPrEx>
-          <w:tblCellMar>
-            <w:top w:w="0" w:type="dxa"/>
-            <w:bottom w:w="0" w:type="dxa"/>
-          </w:tblCellMar>
-        </w:tblPrEx>
         <w:tc>
           <w:tcPr>
             <w:tcW w:w="600" w:type="dxa"/>
@@ -7491,12 +7263,6 @@
         </w:tc>
       </w:tr>
       <w:tr>
-        <w:tblPrEx>
-          <w:tblCellMar>
-            <w:top w:w="0" w:type="dxa"/>
-            <w:bottom w:w="0" w:type="dxa"/>
-          </w:tblCellMar>
-        </w:tblPrEx>
         <w:tc>
           <w:tcPr>
             <w:tcW w:w="600" w:type="dxa"/>
@@ -7671,12 +7437,6 @@
         </w:tc>
       </w:tr>
       <w:tr>
-        <w:tblPrEx>
-          <w:tblCellMar>
-            <w:top w:w="0" w:type="dxa"/>
-            <w:bottom w:w="0" w:type="dxa"/>
-          </w:tblCellMar>
-        </w:tblPrEx>
         <w:tc>
           <w:tcPr>
             <w:tcW w:w="600" w:type="dxa"/>
@@ -7852,12 +7612,6 @@
         </w:tc>
       </w:tr>
       <w:tr>
-        <w:tblPrEx>
-          <w:tblCellMar>
-            <w:top w:w="0" w:type="dxa"/>
-            <w:bottom w:w="0" w:type="dxa"/>
-          </w:tblCellMar>
-        </w:tblPrEx>
         <w:tc>
           <w:tcPr>
             <w:tcW w:w="600" w:type="dxa"/>
@@ -8032,12 +7786,6 @@
         </w:tc>
       </w:tr>
       <w:tr>
-        <w:tblPrEx>
-          <w:tblCellMar>
-            <w:top w:w="0" w:type="dxa"/>
-            <w:bottom w:w="0" w:type="dxa"/>
-          </w:tblCellMar>
-        </w:tblPrEx>
         <w:tc>
           <w:tcPr>
             <w:tcW w:w="600" w:type="dxa"/>
@@ -8212,12 +7960,6 @@
         </w:tc>
       </w:tr>
       <w:tr>
-        <w:tblPrEx>
-          <w:tblCellMar>
-            <w:top w:w="0" w:type="dxa"/>
-            <w:bottom w:w="0" w:type="dxa"/>
-          </w:tblCellMar>
-        </w:tblPrEx>
         <w:tc>
           <w:tcPr>
             <w:tcW w:w="600" w:type="dxa"/>
@@ -8392,12 +8134,6 @@
         </w:tc>
       </w:tr>
       <w:tr>
-        <w:tblPrEx>
-          <w:tblCellMar>
-            <w:top w:w="0" w:type="dxa"/>
-            <w:bottom w:w="0" w:type="dxa"/>
-          </w:tblCellMar>
-        </w:tblPrEx>
         <w:tc>
           <w:tcPr>
             <w:tcW w:w="600" w:type="dxa"/>
@@ -8572,12 +8308,6 @@
         </w:tc>
       </w:tr>
       <w:tr>
-        <w:tblPrEx>
-          <w:tblCellMar>
-            <w:top w:w="0" w:type="dxa"/>
-            <w:bottom w:w="0" w:type="dxa"/>
-          </w:tblCellMar>
-        </w:tblPrEx>
         <w:tc>
           <w:tcPr>
             <w:tcW w:w="600" w:type="dxa"/>
@@ -8752,12 +8482,6 @@
         </w:tc>
       </w:tr>
       <w:tr>
-        <w:tblPrEx>
-          <w:tblCellMar>
-            <w:top w:w="0" w:type="dxa"/>
-            <w:bottom w:w="0" w:type="dxa"/>
-          </w:tblCellMar>
-        </w:tblPrEx>
         <w:tc>
           <w:tcPr>
             <w:tcW w:w="600" w:type="dxa"/>
@@ -8932,12 +8656,6 @@
         </w:tc>
       </w:tr>
       <w:tr>
-        <w:tblPrEx>
-          <w:tblCellMar>
-            <w:top w:w="0" w:type="dxa"/>
-            <w:bottom w:w="0" w:type="dxa"/>
-          </w:tblCellMar>
-        </w:tblPrEx>
         <w:tc>
           <w:tcPr>
             <w:tcW w:w="600" w:type="dxa"/>
@@ -9112,12 +8830,6 @@
         </w:tc>
       </w:tr>
       <w:tr>
-        <w:tblPrEx>
-          <w:tblCellMar>
-            <w:top w:w="0" w:type="dxa"/>
-            <w:bottom w:w="0" w:type="dxa"/>
-          </w:tblCellMar>
-        </w:tblPrEx>
         <w:tc>
           <w:tcPr>
             <w:tcW w:w="600" w:type="dxa"/>
@@ -9292,12 +9004,6 @@
         </w:tc>
       </w:tr>
       <w:tr>
-        <w:tblPrEx>
-          <w:tblCellMar>
-            <w:top w:w="0" w:type="dxa"/>
-            <w:bottom w:w="0" w:type="dxa"/>
-          </w:tblCellMar>
-        </w:tblPrEx>
         <w:tc>
           <w:tcPr>
             <w:tcW w:w="600" w:type="dxa"/>
@@ -9472,12 +9178,6 @@
         </w:tc>
       </w:tr>
       <w:tr>
-        <w:tblPrEx>
-          <w:tblCellMar>
-            <w:top w:w="0" w:type="dxa"/>
-            <w:bottom w:w="0" w:type="dxa"/>
-          </w:tblCellMar>
-        </w:tblPrEx>
         <w:tc>
           <w:tcPr>
             <w:tcW w:w="600" w:type="dxa"/>
@@ -9652,12 +9352,6 @@
         </w:tc>
       </w:tr>
       <w:tr>
-        <w:tblPrEx>
-          <w:tblCellMar>
-            <w:top w:w="0" w:type="dxa"/>
-            <w:bottom w:w="0" w:type="dxa"/>
-          </w:tblCellMar>
-        </w:tblPrEx>
         <w:tc>
           <w:tcPr>
             <w:tcW w:w="600" w:type="dxa"/>
@@ -9832,12 +9526,6 @@
         </w:tc>
       </w:tr>
       <w:tr>
-        <w:tblPrEx>
-          <w:tblCellMar>
-            <w:top w:w="0" w:type="dxa"/>
-            <w:bottom w:w="0" w:type="dxa"/>
-          </w:tblCellMar>
-        </w:tblPrEx>
         <w:tc>
           <w:tcPr>
             <w:tcW w:w="600" w:type="dxa"/>
@@ -10012,12 +9700,6 @@
         </w:tc>
       </w:tr>
       <w:tr>
-        <w:tblPrEx>
-          <w:tblCellMar>
-            <w:top w:w="0" w:type="dxa"/>
-            <w:bottom w:w="0" w:type="dxa"/>
-          </w:tblCellMar>
-        </w:tblPrEx>
         <w:tc>
           <w:tcPr>
             <w:tcW w:w="600" w:type="dxa"/>
@@ -10198,12 +9880,6 @@
         </w:tc>
       </w:tr>
       <w:tr>
-        <w:tblPrEx>
-          <w:tblCellMar>
-            <w:top w:w="0" w:type="dxa"/>
-            <w:bottom w:w="0" w:type="dxa"/>
-          </w:tblCellMar>
-        </w:tblPrEx>
         <w:tc>
           <w:tcPr>
             <w:tcW w:w="600" w:type="dxa"/>
@@ -10378,12 +10054,6 @@
         </w:tc>
       </w:tr>
       <w:tr>
-        <w:tblPrEx>
-          <w:tblCellMar>
-            <w:top w:w="0" w:type="dxa"/>
-            <w:bottom w:w="0" w:type="dxa"/>
-          </w:tblCellMar>
-        </w:tblPrEx>
         <w:tc>
           <w:tcPr>
             <w:tcW w:w="600" w:type="dxa"/>
@@ -10558,12 +10228,6 @@
         </w:tc>
       </w:tr>
       <w:tr>
-        <w:tblPrEx>
-          <w:tblCellMar>
-            <w:top w:w="0" w:type="dxa"/>
-            <w:bottom w:w="0" w:type="dxa"/>
-          </w:tblCellMar>
-        </w:tblPrEx>
         <w:tc>
           <w:tcPr>
             <w:tcW w:w="600" w:type="dxa"/>
@@ -10738,12 +10402,6 @@
         </w:tc>
       </w:tr>
       <w:tr>
-        <w:tblPrEx>
-          <w:tblCellMar>
-            <w:top w:w="0" w:type="dxa"/>
-            <w:bottom w:w="0" w:type="dxa"/>
-          </w:tblCellMar>
-        </w:tblPrEx>
         <w:tc>
           <w:tcPr>
             <w:tcW w:w="600" w:type="dxa"/>
@@ -10918,12 +10576,6 @@
         </w:tc>
       </w:tr>
       <w:tr>
-        <w:tblPrEx>
-          <w:tblCellMar>
-            <w:top w:w="0" w:type="dxa"/>
-            <w:bottom w:w="0" w:type="dxa"/>
-          </w:tblCellMar>
-        </w:tblPrEx>
         <w:tc>
           <w:tcPr>
             <w:tcW w:w="600" w:type="dxa"/>
@@ -11098,12 +10750,6 @@
         </w:tc>
       </w:tr>
       <w:tr>
-        <w:tblPrEx>
-          <w:tblCellMar>
-            <w:top w:w="0" w:type="dxa"/>
-            <w:bottom w:w="0" w:type="dxa"/>
-          </w:tblCellMar>
-        </w:tblPrEx>
         <w:tc>
           <w:tcPr>
             <w:tcW w:w="600" w:type="dxa"/>
@@ -11284,12 +10930,6 @@
         </w:tc>
       </w:tr>
       <w:tr>
-        <w:tblPrEx>
-          <w:tblCellMar>
-            <w:top w:w="0" w:type="dxa"/>
-            <w:bottom w:w="0" w:type="dxa"/>
-          </w:tblCellMar>
-        </w:tblPrEx>
         <w:tc>
           <w:tcPr>
             <w:tcW w:w="600" w:type="dxa"/>
@@ -11464,12 +11104,6 @@
         </w:tc>
       </w:tr>
       <w:tr>
-        <w:tblPrEx>
-          <w:tblCellMar>
-            <w:top w:w="0" w:type="dxa"/>
-            <w:bottom w:w="0" w:type="dxa"/>
-          </w:tblCellMar>
-        </w:tblPrEx>
         <w:tc>
           <w:tcPr>
             <w:tcW w:w="600" w:type="dxa"/>
@@ -11644,12 +11278,6 @@
         </w:tc>
       </w:tr>
       <w:tr>
-        <w:tblPrEx>
-          <w:tblCellMar>
-            <w:top w:w="0" w:type="dxa"/>
-            <w:bottom w:w="0" w:type="dxa"/>
-          </w:tblCellMar>
-        </w:tblPrEx>
         <w:tc>
           <w:tcPr>
             <w:tcW w:w="600" w:type="dxa"/>
@@ -12175,6 +11803,7 @@
           <w:b/>
           <w:bCs/>
         </w:rPr>
+        <w:lastRenderedPageBreak/>
         <w:t xml:space="preserve">Révision spec en v0.3 (faite le 21/05, préalable de R.4) : </w:t>
       </w:r>
       <w:r>
@@ -12491,7 +12120,6 @@
           <w:bCs/>
           <w:lang w:val="en-US"/>
         </w:rPr>
-        <w:lastRenderedPageBreak/>
         <w:t xml:space="preserve">Estimation : </w:t>
       </w:r>
       <w:r>
@@ -12568,6 +12196,7 @@
           <w:b/>
           <w:bCs/>
         </w:rPr>
+        <w:lastRenderedPageBreak/>
         <w:t xml:space="preserve">Thème : </w:t>
       </w:r>
       <w:r>
@@ -13076,26 +12705,27 @@
           <w:b/>
           <w:bCs/>
         </w:rPr>
+        <w:t xml:space="preserve">Estimation : </w:t>
+      </w:r>
+      <w:r>
+        <w:t>Gros chantier — à cadrer (probablement 2-3 semaines)</w:t>
+      </w:r>
+    </w:p>
+    <w:p>
+      <w:pPr>
+        <w:spacing w:after="120"/>
+      </w:pPr>
+      <w:r>
+        <w:rPr>
+          <w:b/>
+          <w:bCs/>
+        </w:rPr>
+        <w:t xml:space="preserve">Notes : </w:t>
+      </w:r>
+      <w:r>
+        <w:t xml:space="preserve">Implémentation des volets 1-10 de spec-onboarding-biblioteca v1.1 §6 (volet 0 livré 19/05 dans F.3 du chantier profils). Enrichi par doctrine anti-méga-machine : encadré canal humain par volet, bouton « proposer un échange » côté </w:t>
         <w:lastRenderedPageBreak/>
-        <w:t xml:space="preserve">Estimation : </w:t>
-      </w:r>
-      <w:r>
-        <w:t>Gros chantier — à cadrer (probablement 2-3 semaines)</w:t>
-      </w:r>
-    </w:p>
-    <w:p>
-      <w:pPr>
-        <w:spacing w:after="120"/>
-      </w:pPr>
-      <w:r>
-        <w:rPr>
-          <w:b/>
-          <w:bCs/>
-        </w:rPr>
-        <w:t xml:space="preserve">Notes : </w:t>
-      </w:r>
-      <w:r>
-        <w:t>Implémentation des volets 1-10 de spec-onboarding-biblioteca v1.1 §6 (volet 0 livré 19/05 dans F.3 du chantier profils). Enrichi par doctrine anti-méga-machine : encadré canal humain par volet, bouton « proposer un échange » côté admins réseau, PDF règlement = artefact de délibération collective pas certificat technique. Idée alternative à reconsidérer : parcours d'entrée sur anarbib.org plutôt que app.anarbib.org.</w:t>
+        <w:t>admins réseau, PDF règlement = artefact de délibération collective pas certificat technique. Idée alternative à reconsidérer : parcours d'entrée sur anarbib.org plutôt que app.anarbib.org.</w:t>
       </w:r>
     </w:p>
     <w:p>
@@ -13556,49 +13186,35 @@
     <w:p>
       <w:pPr>
         <w:spacing w:after="120"/>
-        <w:rPr>
+      </w:pPr>
+      <w:r>
+        <w:rPr>
+          <w:b/>
+          <w:bCs/>
           <w:lang w:val="en-US"/>
         </w:rPr>
-      </w:pPr>
-      <w:r>
-        <w:rPr>
-          <w:b/>
-          <w:bCs/>
+        <w:t xml:space="preserve">Notes : </w:t>
+      </w:r>
+      <w:r>
+        <w:rPr>
           <w:lang w:val="en-US"/>
         </w:rPr>
-        <w:t xml:space="preserve">Notes : </w:t>
-      </w:r>
-      <w:r>
-        <w:rPr>
-          <w:lang w:val="en-US"/>
-        </w:rPr>
-        <w:t>Issu audit #150 (18/05). publish_book_draft, publish_author_draft, publish_exemplar_draft, publish_catalog_batch, create_*_draft_from_*, fn_bulk_*. Trou RBAC, pas ACL.</w:t>
-      </w:r>
-    </w:p>
-    <w:p>
-      <w:pPr>
-        <w:rPr>
-          <w:lang w:val="en-US"/>
-        </w:rPr>
-      </w:pPr>
-      <w:r>
-        <w:rPr>
-          <w:lang w:val="en-US"/>
-        </w:rPr>
+        <w:t xml:space="preserve">Issu audit #150 (18/05). publish_book_draft, publish_author_draft, publish_exemplar_draft, publish_catalog_batch, create_*_draft_from_*, fn_bulk_*. </w:t>
+      </w:r>
+      <w:r>
+        <w:t>Trou RBAC, pas ACL.</w:t>
+      </w:r>
+    </w:p>
+    <w:p>
+      <w:r>
         <w:br w:type="page"/>
       </w:r>
     </w:p>
     <w:p>
       <w:pPr>
         <w:pStyle w:val="Titre1"/>
-        <w:rPr>
-          <w:lang w:val="en-US"/>
-        </w:rPr>
-      </w:pPr>
-      <w:r>
-        <w:rPr>
-          <w:lang w:val="en-US"/>
-        </w:rPr>
+      </w:pPr>
+      <w:r>
         <w:lastRenderedPageBreak/>
         <w:t>E. Annexe : items hygiène et nice-to-have</w:t>
       </w:r>
@@ -13613,7 +13229,7 @@
           <w:iCs/>
           <w:color w:val="6B7280"/>
         </w:rPr>
-        <w:t xml:space="preserve">Amendement v8.1 (20/05, soir) : trois items ajoutés en fin de cette annexe — #151 (compteur AUTORIDADES à repenser au niveau réseau), #152 (outil de détection de proches-doublons au catalogage), #153 (audit transverse des contenus de mails automatisés). Item #16 mis à jour : cause du bundle surdimensionné identifiée (locales i18n chargées statiquement), score relevé de 4 à 7. Le tableau récapitulatif de la section C n’a pas été régénéré pour ces trois ajouts ; les fiches ci-dessous font foi. Total ouvert porté de 61 à 64.</w:t>
+        <w:t>Amendement v8.1 (20/05, soir) : trois items ajoutés en fin de cette annexe — #151 (compteur AUTORIDADES à repenser au niveau réseau), #152 (outil de détection de proches-doublons au catalogage), #153 (audit transverse des contenus de mails automatisés). Item #16 mis à jour : cause du bundle surdimensionné identifiée (locales i18n chargées statiquement), score relevé de 4 à 7. Le tableau récapitulatif de la section C n’a pas été régénéré pour ces trois ajouts ; les fiches ci-dessous font foi. Total ouvert porté de 61 à 64.</w:t>
       </w:r>
     </w:p>
     <w:p>
@@ -13626,7 +13242,7 @@
           <w:iCs/>
           <w:color w:val="6B7280"/>
         </w:rPr>
-        <w:t xml:space="preserve">Amendement v10 (21/05, nuit, post-clôture R.3 du chantier #110) : trois items ajoutés en fin de cette annexe — #154 (robustesse notify-internal-task sur task_id non-UUID), #155 (câblage de bout en bout de l’invitation de participant·es aux tâches internes), #156 (library_contact_profiles sans éditeur frontend). La fiche #110 a été enrichie de l’avancement R.1–R.3, de la révision de spec en v0.3 à mener avant R.4 (couture R.1↔R.3), et d’une note technique. Trois sous-constats versés dans la fiche #153 (logos dépendant de la source, harmonisation des rendus de register, délivrabilité spam Gmail). Une note ajoutée à la fiche #119 (rotation du secret WEBHOOK_SECRET_NOTIFY_INTERNAL_TASK). Comme pour l’amendement v8.1, le tableau récapitulatif de la section C n’a pas été régénéré pour ces trois ajouts ni pour #151–#153 ; les fiches font foi. Total ouvert porté de 64 à 67.</w:t>
+        <w:t>Amendement v10 (21/05, nuit, post-clôture R.3 du chantier #110) : trois items ajoutés en fin de cette annexe — #154 (robustesse notify-internal-task sur task_id non-UUID), #155 (câblage de bout en bout de l’invitation de participant·es aux tâches internes), #156 (library_contact_profiles sans éditeur frontend). La fiche #110 a été enrichie de l’avancement R.1–R.3, de la révision de spec en v0.3 à mener avant R.4 (couture R.1↔R.3), et d’une note technique. Trois sous-constats versés dans la fiche #153 (logos dépendant de la source, harmonisation des rendus de register, délivrabilité spam Gmail). Une note ajoutée à la fiche #119 (rotation du secret WEBHOOK_SECRET_NOTIFY_INTERNAL_TASK). Comme pour l’amendement v8.1, le tableau récapitulatif de la section C n’a pas été régénéré pour ces trois ajouts ni pour #151–#153 ; les fiches font foi. Total ouvert porté de 64 à 67.</w:t>
       </w:r>
     </w:p>
     <w:p>
@@ -13639,21 +13255,491 @@
           <w:iCs/>
           <w:color w:val="6B7280"/>
         </w:rPr>
-        <w:t xml:space="preserve">Amendement v11 (21/05, nuit, post-clôture R.4 du chantier #110) : un item ajouté en fin de cette annexe — #157 (gestion de réservation côté conta : un·e lecteur·rice ne peut pas gérer sa propre réservation). La fiche #110 a été enrichie du bloc R.4 (bascule MAIL_PROVIDER=resend effectuée le 21/05 ~21h08, cinq familles validées, silence de Brevo confirmé) et du constat « couture variantes de sender » (ANARBIB_SENDER_EMAIL et NETWORK_SENDER_EMAIL alignées en cours de R.4) ; la révision de spec v0.3 y est actée comme faite. Deux sous-constats versés dans la fiche #153 (annulation de réservation : mail biblio adressé au lecteur ; reserva→emprunt : double envoi). Comme pour les amendements précédents, le tableau récapitulatif de la section C n’a pas été régénéré ; les fiches font foi. Total ouvert porté de 67 à 68.</w:t>
+        <w:t>Amendement v11 (21/05, nuit, post-clôture R.4 du chantier #110) : un item ajouté en fin de cette annexe — #157 (gestion de réservation côté conta : un·e lecteur·rice ne peut pas gérer sa propre réservation). La fiche #110 a été enrichie du bloc R.4 (bascule MAIL_PROVIDER=resend effectuée le 21/05 ~21h08, cinq familles validées, silence de Brevo confirmé) et du constat « couture variantes de sender » (ANARBIB_SENDER_EMAIL et NETWORK_SENDER_EMAIL alignées en cours de R.4) ; la révision de spec v0.3 y est actée comme faite. Deux sous-constats versés dans la fiche #153 (annulation de réservation : mail biblio adressé au lecteur ; reserva→emprunt : double envoi). Comme pour les amendements précédents, le tableau récapitulatif de la section C n’a pas été régénéré ; les fiches font foi. Total ouvert porté de 67 à 68.</w:t>
       </w:r>
     </w:p>
     <w:p>
       <w:pPr>
         <w:pStyle w:val="Titre2"/>
+      </w:pPr>
+      <w:r>
+        <w:t>Hygiène (8-11) — 19 items</w:t>
+      </w:r>
+    </w:p>
+    <w:p>
+      <w:pPr>
+        <w:spacing w:after="120"/>
+      </w:pPr>
+      <w:r>
+        <w:rPr>
+          <w:b/>
+          <w:bCs/>
+        </w:rPr>
+        <w:t>#138 — D2 workflow stage côté lecteur·rice</w:t>
+      </w:r>
+      <w:r>
+        <w:rPr>
+          <w:i/>
+          <w:iCs/>
+          <w:color w:val="6B7280"/>
+        </w:rPr>
+        <w:t xml:space="preserve"> (UX, score 11, 2-3h)</w:t>
+      </w:r>
+    </w:p>
+    <w:p>
+      <w:pPr>
+        <w:spacing w:after="120"/>
+      </w:pPr>
+      <w:r>
+        <w:rPr>
+          <w:color w:val="4B5563"/>
+        </w:rPr>
+        <w:t>Affichage des étapes du workflow consulta côté lecteur.</w:t>
+      </w:r>
+    </w:p>
+    <w:p>
+      <w:pPr>
+        <w:spacing w:after="120"/>
+      </w:pPr>
+      <w:r>
+        <w:rPr>
+          <w:b/>
+          <w:bCs/>
+        </w:rPr>
+        <w:t>#139 — Spec consultas v2.2 — intégrer doctrines internalisées</w:t>
+      </w:r>
+      <w:r>
+        <w:rPr>
+          <w:i/>
+          <w:iCs/>
+          <w:color w:val="6B7280"/>
+        </w:rPr>
+        <w:t xml:space="preserve"> (Spec, score 11, 3-4h)</w:t>
+      </w:r>
+    </w:p>
+    <w:p>
+      <w:pPr>
+        <w:spacing w:after="120"/>
+      </w:pPr>
+      <w:r>
+        <w:rPr>
+          <w:color w:val="4B5563"/>
+        </w:rPr>
+        <w:t>Doctrine #141.2.E (ordre UPDATE narrative-avant-état), #141.2.C (distinction workflow_note vs schedule_reply_note), R8 (mail coordination), D3-D6 toggles.</w:t>
+      </w:r>
+    </w:p>
+    <w:p>
+      <w:pPr>
+        <w:spacing w:after="120"/>
+      </w:pPr>
+      <w:r>
+        <w:rPr>
+          <w:b/>
+          <w:bCs/>
+        </w:rPr>
+        <w:t>#K2 — Galerie multi-bibliothèques sur anarbib.org (type RebAL)</w:t>
+      </w:r>
+      <w:r>
+        <w:rPr>
+          <w:i/>
+          <w:iCs/>
+          <w:color w:val="6B7280"/>
+        </w:rPr>
+        <w:t xml:space="preserve"> (Onboarding, score 11, LIVRÉ 21/05/2026)</w:t>
+      </w:r>
+    </w:p>
+    <w:p>
+      <w:pPr>
+        <w:spacing w:after="120"/>
+      </w:pPr>
+      <w:r>
+        <w:rPr>
+          <w:color w:val="4B5563"/>
+        </w:rPr>
+        <w:t>BOUCLÉ 21/05/2026. Galerie type RebAL livrée en 8 langues sur le site anarbib.org (/&lt;lang&gt;/explorar/), intégrée au gabarit du site. Cartes : nom, ville (pointeur vers OPAC), affiliation, volumétrie (notices), badge, boutons 'Voir le catalogue' + 'Site web'. Backend : vue api.public_libraries (security_invoker, lecture anon, scope visibility_level='public'), 2 colonnes additives sur library_commons (affiliation_label, website_url), métadonnées BLMF renseignées. App : route alias /catalogo/:slug pour le scoping mono-bibliothèque (copySearchLink réparé au passage). Onboarding : bandeau vitrine sur /criar-conta pointant vers la galerie. Arbitrage acté : D7 absorbé — la route provisoire /explorar prévue dans la spec criar-conta v0.2 est abandonnée au profit de la vraie galerie. 5 migrations/paquets, 6 langues i18n app + 8 langues site. État réel du réseau au lancement : 1 seule biblio publique exposée (BLMF), la galerie se peuple seule (vitrine vivante).</w:t>
+      </w:r>
+    </w:p>
+    <w:p>
+      <w:pPr>
+        <w:spacing w:after="120"/>
+      </w:pPr>
+      <w:r>
+        <w:rPr>
+          <w:b/>
+          <w:bCs/>
+        </w:rPr>
+        <w:t>#MM3 — Encadrés inline « parlons-en avant » sur pages Biblioteca sensibles</w:t>
+      </w:r>
+      <w:r>
+        <w:rPr>
+          <w:i/>
+          <w:iCs/>
+          <w:color w:val="6B7280"/>
+        </w:rPr>
+        <w:t xml:space="preserve"> (Anti-méga-machine, score 11, 2-3h (4 encadrés ciblés + i18n))</w:t>
+      </w:r>
+    </w:p>
+    <w:p>
+      <w:pPr>
+        <w:spacing w:after="120"/>
+      </w:pPr>
+      <w:r>
+        <w:rPr>
+          <w:color w:val="4B5563"/>
+        </w:rPr>
+        <w:t>Pages : gouvernance, profil d'adoption, transitions, regimento. Encadré inline visible (pas un footer générique). Anticipe le scénario où un coordenador est bloqué·e sur une décision configurante.</w:t>
+      </w:r>
+    </w:p>
+    <w:p>
+      <w:pPr>
+        <w:spacing w:after="120"/>
+      </w:pPr>
+      <w:r>
+        <w:rPr>
+          <w:b/>
+          <w:bCs/>
+        </w:rPr>
+        <w:t>#K3 — Rattachement automatique lectrices orphelines (phase 2 Karina)</w:t>
+      </w:r>
+      <w:r>
+        <w:rPr>
+          <w:i/>
+          <w:iCs/>
+          <w:color w:val="6B7280"/>
+        </w:rPr>
+        <w:t xml:space="preserve"> (Onboarding, score 10, 1 session backend + 1 frontend)</w:t>
+      </w:r>
+    </w:p>
+    <w:p>
+      <w:pPr>
+        <w:spacing w:after="120"/>
+      </w:pPr>
+      <w:r>
+        <w:rPr>
+          <w:color w:val="4B5563"/>
+        </w:rPr>
+        <w:t>Quand biblio mentionnée par lectrice orpheline rejoint AnarBib : claim reader_attachment. Spec dédiée à rédiger (scénarios A/B/C : admin réseau push, /conta pull, ou hybride).</w:t>
+      </w:r>
+    </w:p>
+    <w:p>
+      <w:pPr>
+        <w:spacing w:after="120"/>
+      </w:pPr>
+      <w:r>
+        <w:rPr>
+          <w:b/>
+          <w:bCs/>
+        </w:rPr>
+        <w:t>#MM4 — Page /conversemos : canal humain premier, guides seconds</w:t>
+      </w:r>
+      <w:r>
+        <w:rPr>
+          <w:i/>
+          <w:iCs/>
+          <w:color w:val="6B7280"/>
+        </w:rPr>
+        <w:t xml:space="preserve"> (Anti-méga-machine, score 10, 3-4h (page complète + routing + i18n × 6 locales))</w:t>
+      </w:r>
+    </w:p>
+    <w:p>
+      <w:pPr>
+        <w:spacing w:after="120"/>
+      </w:pPr>
+      <w:r>
+        <w:rPr>
+          <w:color w:val="4B5563"/>
+        </w:rPr>
+        <w:lastRenderedPageBreak/>
+        <w:t>Page courte qui présente AnarBib comme une fédération outillée par un SIGB (pas l'inverse). Doctrine §2.2 exigence 3 : les admins réseau sont des camarades qui partagent la connaissance, pas une hotline.</w:t>
+      </w:r>
+    </w:p>
+    <w:p>
+      <w:pPr>
+        <w:spacing w:after="120"/>
+      </w:pPr>
+      <w:r>
+        <w:rPr>
+          <w:b/>
+          <w:bCs/>
+        </w:rPr>
+        <w:t>#31 — Test E2E parcours lecteur réservation → retrait</w:t>
+      </w:r>
+      <w:r>
+        <w:rPr>
+          <w:i/>
+          <w:iCs/>
+          <w:color w:val="6B7280"/>
+        </w:rPr>
+        <w:t xml:space="preserve"> (Tests, score 9, 1 session)</w:t>
+      </w:r>
+    </w:p>
+    <w:p>
+      <w:pPr>
+        <w:spacing w:after="120"/>
+      </w:pPr>
+      <w:r>
+        <w:rPr>
+          <w:color w:val="4B5563"/>
+        </w:rPr>
+        <w:t>Pendant lecteur de #32.</w:t>
+      </w:r>
+    </w:p>
+    <w:p>
+      <w:pPr>
+        <w:spacing w:after="120"/>
+      </w:pPr>
+      <w:r>
+        <w:rPr>
+          <w:b/>
+          <w:bCs/>
+        </w:rPr>
+        <w:t>#35 — Composant StaffMembershipManager (renouvellements)</w:t>
+      </w:r>
+      <w:r>
+        <w:rPr>
+          <w:i/>
+          <w:iCs/>
+          <w:color w:val="6B7280"/>
+        </w:rPr>
+        <w:t xml:space="preserve"> (Membership, score 9, 1 session)</w:t>
+      </w:r>
+    </w:p>
+    <w:p>
+      <w:pPr>
+        <w:spacing w:after="120"/>
+      </w:pPr>
+      <w:r>
+        <w:rPr>
+          <w:color w:val="4B5563"/>
+        </w:rPr>
+        <w:t>Lié à #34.</w:t>
+      </w:r>
+    </w:p>
+    <w:p>
+      <w:pPr>
+        <w:spacing w:after="120"/>
+      </w:pPr>
+      <w:r>
+        <w:rPr>
+          <w:b/>
+          <w:bCs/>
+        </w:rPr>
+        <w:t>#4 — Documenter SECURITY DEFINER via COMMENT ON FUNCTION</w:t>
+      </w:r>
+      <w:r>
+        <w:rPr>
+          <w:i/>
+          <w:iCs/>
+          <w:color w:val="6B7280"/>
+        </w:rPr>
+        <w:t xml:space="preserve"> (Sécurité, score 9, 2-3 sessions)</w:t>
+      </w:r>
+    </w:p>
+    <w:p>
+      <w:pPr>
+        <w:spacing w:after="120"/>
+      </w:pPr>
+      <w:r>
+        <w:rPr>
+          <w:color w:val="4B5563"/>
+        </w:rPr>
+        <w:t>Reste 80 fonctions. Distinct de #150 (qui isole ACL sans toucher COMMENT).</w:t>
+      </w:r>
+    </w:p>
+    <w:p>
+      <w:pPr>
+        <w:spacing w:after="120"/>
+      </w:pPr>
+      <w:r>
+        <w:rPr>
+          <w:b/>
+          <w:bCs/>
+        </w:rPr>
+        <w:t>#64 — Page Rede : vue réseau fédératif des biblios</w:t>
+      </w:r>
+      <w:r>
+        <w:rPr>
+          <w:i/>
+          <w:iCs/>
+          <w:color w:val="6B7280"/>
+        </w:rPr>
+        <w:t xml:space="preserve"> (Réseau, score 9, 1-2 sessions)</w:t>
+      </w:r>
+    </w:p>
+    <w:p>
+      <w:pPr>
+        <w:spacing w:after="120"/>
+      </w:pPr>
+      <w:r>
+        <w:rPr>
+          <w:color w:val="4B5563"/>
+        </w:rPr>
+        <w:t>Vitrine interne (différente de la galerie publique K2).</w:t>
+      </w:r>
+    </w:p>
+    <w:p>
+      <w:pPr>
+        <w:spacing w:after="120"/>
+      </w:pPr>
+      <w:r>
+        <w:rPr>
+          <w:b/>
+          <w:bCs/>
+        </w:rPr>
+        <w:t>#OPAC1 — Barre d'actions de notice : citer / mail / imprimer / exporter / permalien</w:t>
+      </w:r>
+      <w:r>
+        <w:rPr>
+          <w:i/>
+          <w:iCs/>
+          <w:color w:val="6B7280"/>
+        </w:rPr>
+        <w:t xml:space="preserve"> (OPAC, score 9, 1 session)</w:t>
+      </w:r>
+    </w:p>
+    <w:p>
+      <w:pPr>
+        <w:spacing w:after="120"/>
+      </w:pPr>
+      <w:r>
+        <w:rPr>
+          <w:color w:val="4B5563"/>
+        </w:rPr>
+        <w:t>Citer (APA/Chicago/MLA), envoyer par courriel, imprimer, exporter (BibTeX/RIS/MARC), permalien stable. Inspiré RebAL. Utile pour usage chercheur·euses et militant·es documenté·es.</w:t>
+      </w:r>
+    </w:p>
+    <w:p>
+      <w:pPr>
+        <w:spacing w:after="120"/>
+      </w:pPr>
+      <w:r>
+        <w:rPr>
+          <w:b/>
+          <w:bCs/>
+        </w:rPr>
+        <w:t>#OPAC3 — Liens autorités systématiques sur tous les contributeurs</w:t>
+      </w:r>
+      <w:r>
+        <w:rPr>
+          <w:i/>
+          <w:iCs/>
+          <w:color w:val="6B7280"/>
+        </w:rPr>
+        <w:t xml:space="preserve"> (OPAC, score 9, 1 session)</w:t>
+      </w:r>
+    </w:p>
+    <w:p>
+      <w:pPr>
+        <w:spacing w:after="120"/>
         <w:rPr>
           <w:lang w:val="en-US"/>
         </w:rPr>
       </w:pPr>
       <w:r>
         <w:rPr>
+          <w:color w:val="4B5563"/>
+        </w:rPr>
+        <w:t xml:space="preserve">Auteur principal + tous co-auteurs/traducteurs/illustrateurs cliquables vers fiche autorité. </w:t>
+      </w:r>
+      <w:r>
+        <w:rPr>
+          <w:color w:val="4B5563"/>
           <w:lang w:val="en-US"/>
         </w:rPr>
-        <w:t>Hygiène (8-11) — 19 items</w:t>
+        <w:t>Fondation existe (authors, book_contributors, link_author_to_book_contributors).</w:t>
+      </w:r>
+    </w:p>
+    <w:p>
+      <w:pPr>
+        <w:spacing w:after="120"/>
+      </w:pPr>
+      <w:r>
+        <w:rPr>
+          <w:b/>
+          <w:bCs/>
+        </w:rPr>
+        <w:t>#115 — Code-split PanelPage.jsx (~2300 lignes après #143)</w:t>
+      </w:r>
+      <w:r>
+        <w:rPr>
+          <w:i/>
+          <w:iCs/>
+          <w:color w:val="6B7280"/>
+        </w:rPr>
+        <w:t xml:space="preserve"> (Performance, score 8, 2-3h)</w:t>
+      </w:r>
+    </w:p>
+    <w:p>
+      <w:pPr>
+        <w:spacing w:after="120"/>
+      </w:pPr>
+      <w:r>
+        <w:rPr>
+          <w:color w:val="4B5563"/>
+        </w:rPr>
+        <w:t>Warning Vite &gt; 500KB persistant. AccountPage aussi (#13).</w:t>
+      </w:r>
+    </w:p>
+    <w:p>
+      <w:pPr>
+        <w:spacing w:after="120"/>
+      </w:pPr>
+      <w:r>
+        <w:rPr>
+          <w:b/>
+          <w:bCs/>
+        </w:rPr>
+        <w:t>#119 — Audit secrets : tokens Codeberg, Woodpecker, Windows Cred Mgr</w:t>
+      </w:r>
+      <w:r>
+        <w:rPr>
+          <w:i/>
+          <w:iCs/>
+          <w:color w:val="6B7280"/>
+        </w:rPr>
+        <w:t xml:space="preserve"> (Hygiène, score 8, 2-3h)</w:t>
+      </w:r>
+    </w:p>
+    <w:p>
+      <w:pPr>
+        <w:spacing w:after="120"/>
+      </w:pPr>
+      <w:r>
+        <w:rPr>
+          <w:color w:val="4B5563"/>
+        </w:rPr>
+        <w:t>Local auth break régulier.</w:t>
+      </w:r>
+    </w:p>
+    <w:p>
+      <w:pPr>
+        <w:spacing w:after="120"/>
+      </w:pPr>
+      <w:r>
+        <w:rPr>
+          <w:color w:val="4B5563"/>
+        </w:rPr>
+        <w:t>Ajout 21/05 — à intégrer au périmètre de cet audit : le secret WEBHOOK_SECRET_NOTIFY_INTERNAL_TASK a été rotaté le 21/05 pendant la session R.3 (l’ancienne valeur était introuvable, écart constaté par comparaison de digest SHA-256 ; nouvelle valeur = 32 octets base64, posée via « supabase secrets set »). Conséquence à traiter : le webhook Postgres qui déclenche notify-internal-task continue d’envoyer l’ancienne valeur — il devra être mis en cohérence avec la nouvelle avant toute mise en service réelle des notifications de tâches internes, sinon elles tomberaient en 401. Sans effet aujourd’hui (rien en production réelle), mais à ne pas oublier.</w:t>
+      </w:r>
+    </w:p>
+    <w:p>
+      <w:pPr>
+        <w:spacing w:after="120"/>
+      </w:pPr>
+      <w:r>
+        <w:rPr>
+          <w:b/>
+          <w:bCs/>
+        </w:rPr>
+        <w:t>#149 — Pattern erreurs RPC silencieuses (audit + helper)</w:t>
+      </w:r>
+      <w:r>
+        <w:rPr>
+          <w:i/>
+          <w:iCs/>
+          <w:color w:val="6B7280"/>
+        </w:rPr>
+        <w:t xml:space="preserve"> (Hygiène, score 8, 2-3h)</w:t>
       </w:r>
     </w:p>
     <w:p>
@@ -13665,11 +13751,211 @@
       </w:pPr>
       <w:r>
         <w:rPr>
-          <w:b/>
-          <w:bCs/>
+          <w:color w:val="4B5563"/>
           <w:lang w:val="en-US"/>
         </w:rPr>
-        <w:t>#138 — D2 workflow stage côté lecteur·rice</w:t>
+        <w:t>Bug #132 type : console.error sans feedback UI. Helper handleRpcError(err) + toast/banner.</w:t>
+      </w:r>
+    </w:p>
+    <w:p>
+      <w:pPr>
+        <w:spacing w:after="120"/>
+      </w:pPr>
+      <w:r>
+        <w:rPr>
+          <w:b/>
+          <w:bCs/>
+        </w:rPr>
+        <w:t>#20 — must_change_password : enforcement réel au login manquant</w:t>
+      </w:r>
+      <w:r>
+        <w:rPr>
+          <w:i/>
+          <w:iCs/>
+          <w:color w:val="6B7280"/>
+        </w:rPr>
+        <w:t xml:space="preserve"> (Sécurité, score 8, 1-2h)</w:t>
+      </w:r>
+    </w:p>
+    <w:p>
+      <w:pPr>
+        <w:spacing w:after="120"/>
+      </w:pPr>
+      <w:r>
+        <w:rPr>
+          <w:color w:val="4B5563"/>
+        </w:rPr>
+        <w:t>Affiché dans PanelPage mais pas bloqué au login.</w:t>
+      </w:r>
+    </w:p>
+    <w:p>
+      <w:pPr>
+        <w:spacing w:after="120"/>
+      </w:pPr>
+      <w:r>
+        <w:rPr>
+          <w:b/>
+          <w:bCs/>
+        </w:rPr>
+        <w:t>#25 — Notifications expiration cotisation (7j, 1j, jour J)</w:t>
+      </w:r>
+      <w:r>
+        <w:rPr>
+          <w:i/>
+          <w:iCs/>
+          <w:color w:val="6B7280"/>
+        </w:rPr>
+        <w:t xml:space="preserve"> (Cotisations, score 8, 2-3h)</w:t>
+      </w:r>
+    </w:p>
+    <w:p>
+      <w:pPr>
+        <w:spacing w:after="120"/>
+      </w:pPr>
+      <w:r>
+        <w:rPr>
+          <w:color w:val="4B5563"/>
+        </w:rPr>
+        <w:t>Après bouclage #33/#36.</w:t>
+      </w:r>
+    </w:p>
+    <w:p>
+      <w:pPr>
+        <w:spacing w:after="120"/>
+      </w:pPr>
+      <w:r>
+        <w:rPr>
+          <w:b/>
+          <w:bCs/>
+        </w:rPr>
+        <w:t>#6 — (nulld, nullx) pour règles circulation non-renouvelables</w:t>
+      </w:r>
+      <w:r>
+        <w:rPr>
+          <w:i/>
+          <w:iCs/>
+          <w:color w:val="6B7280"/>
+        </w:rPr>
+        <w:t xml:space="preserve"> (Bugs UX, score 8, 1h)</w:t>
+      </w:r>
+    </w:p>
+    <w:p>
+      <w:pPr>
+        <w:spacing w:after="120"/>
+      </w:pPr>
+      <w:r>
+        <w:rPr>
+          <w:color w:val="4B5563"/>
+        </w:rPr>
+        <w:t>À conditionner par circulation_mode.</w:t>
+      </w:r>
+    </w:p>
+    <w:p>
+      <w:pPr>
+        <w:spacing w:after="120"/>
+      </w:pPr>
+      <w:r>
+        <w:rPr>
+          <w:b/>
+          <w:bCs/>
+        </w:rPr>
+        <w:t>#OPAC6 — Onglet 'Description' avec résumé/notes/sujets bien structuré</w:t>
+      </w:r>
+      <w:r>
+        <w:rPr>
+          <w:i/>
+          <w:iCs/>
+          <w:color w:val="6B7280"/>
+        </w:rPr>
+        <w:t xml:space="preserve"> (OPAC, score 8, 0.5-1 session)</w:t>
+      </w:r>
+    </w:p>
+    <w:p>
+      <w:pPr>
+        <w:spacing w:after="120"/>
+      </w:pPr>
+      <w:r>
+        <w:rPr>
+          <w:color w:val="4B5563"/>
+        </w:rPr>
+        <w:t>Champ description riche dans book_drafts, à exposer en onglet dédié sur livro.html.</w:t>
+      </w:r>
+    </w:p>
+    <w:p>
+      <w:pPr>
+        <w:pStyle w:val="Titre2"/>
+      </w:pPr>
+      <w:r>
+        <w:t>Nice-to-have (≤ 7) — 25 items</w:t>
+      </w:r>
+    </w:p>
+    <w:p>
+      <w:pPr>
+        <w:spacing w:after="120"/>
+      </w:pPr>
+      <w:r>
+        <w:rPr>
+          <w:b/>
+          <w:bCs/>
+        </w:rPr>
+        <w:t xml:space="preserve">#147 — </w:t>
+      </w:r>
+      <w:r>
+        <w:t>LanguagePicker : retirer drapeaux d'États, noms en langue propre</w:t>
+      </w:r>
+      <w:r>
+        <w:rPr>
+          <w:i/>
+          <w:iCs/>
+          <w:color w:val="6B7280"/>
+        </w:rPr>
+        <w:t xml:space="preserve"> (i18n, score 7, 1h)</w:t>
+      </w:r>
+    </w:p>
+    <w:p>
+      <w:pPr>
+        <w:spacing w:after="120"/>
+      </w:pPr>
+      <w:r>
+        <w:rPr>
+          <w:b/>
+          <w:bCs/>
+        </w:rPr>
+        <w:t xml:space="preserve">#13 — </w:t>
+      </w:r>
+      <w:r>
+        <w:t>Code-split AccountPage.jsx (~1400 lignes)</w:t>
+      </w:r>
+      <w:r>
+        <w:rPr>
+          <w:i/>
+          <w:iCs/>
+          <w:color w:val="6B7280"/>
+        </w:rPr>
+        <w:t xml:space="preserve"> (Performance, score 6, 2-3h)</w:t>
+      </w:r>
+    </w:p>
+    <w:p>
+      <w:pPr>
+        <w:spacing w:after="120"/>
+        <w:rPr>
+          <w:lang w:val="en-US"/>
+        </w:rPr>
+      </w:pPr>
+      <w:r>
+        <w:rPr>
+          <w:b/>
+          <w:bCs/>
+          <w:lang w:val="en-US"/>
+        </w:rPr>
+        <w:lastRenderedPageBreak/>
+        <w:t xml:space="preserve">#34 — </w:t>
+      </w:r>
+      <w:r>
+        <w:rPr>
+          <w:lang w:val="en-US"/>
+        </w:rPr>
+        <w:t>Composant ReaderMembershipBadge (statut lecteur)</w:t>
       </w:r>
       <w:r>
         <w:rPr>
@@ -13678,61 +13964,53 @@
           <w:color w:val="6B7280"/>
           <w:lang w:val="en-US"/>
         </w:rPr>
-        <w:t xml:space="preserve"> (UX, score 11, 2-3h)</w:t>
-      </w:r>
-    </w:p>
-    <w:p>
-      <w:pPr>
-        <w:spacing w:after="120"/>
-      </w:pPr>
-      <w:r>
-        <w:rPr>
-          <w:color w:val="4B5563"/>
-        </w:rPr>
-        <w:t>Affichage des étapes du workflow consulta côté lecteur.</w:t>
-      </w:r>
-    </w:p>
-    <w:p>
-      <w:pPr>
-        <w:spacing w:after="120"/>
-      </w:pPr>
-      <w:r>
-        <w:rPr>
-          <w:b/>
-          <w:bCs/>
-        </w:rPr>
-        <w:t>#139 — Spec consultas v2.2 — intégrer doctrines internalisées</w:t>
+        <w:t xml:space="preserve"> (Membership, score 6, 1-2h)</w:t>
+      </w:r>
+    </w:p>
+    <w:p>
+      <w:pPr>
+        <w:spacing w:after="120"/>
+        <w:rPr>
+          <w:lang w:val="pt-BR"/>
+        </w:rPr>
+      </w:pPr>
+      <w:r>
+        <w:rPr>
+          <w:b/>
+          <w:bCs/>
+          <w:lang w:val="pt-BR"/>
+        </w:rPr>
+        <w:t xml:space="preserve">#51 — </w:t>
+      </w:r>
+      <w:r>
+        <w:rPr>
+          <w:lang w:val="pt-BR"/>
+        </w:rPr>
+        <w:t>ReaderPage i18n (0 occurrence confirmée)</w:t>
       </w:r>
       <w:r>
         <w:rPr>
           <w:i/>
           <w:iCs/>
           <w:color w:val="6B7280"/>
-        </w:rPr>
-        <w:t xml:space="preserve"> (Spec, score 11, 3-4h)</w:t>
-      </w:r>
-    </w:p>
-    <w:p>
-      <w:pPr>
-        <w:spacing w:after="120"/>
-      </w:pPr>
-      <w:r>
-        <w:rPr>
-          <w:color w:val="4B5563"/>
-        </w:rPr>
-        <w:t>Doctrine #141.2.E (ordre UPDATE narrative-avant-état), #141.2.C (distinction workflow_note vs schedule_reply_note), R8 (mail coordination), D3-D6 toggles.</w:t>
-      </w:r>
-    </w:p>
-    <w:p>
-      <w:pPr>
-        <w:spacing w:after="120"/>
-      </w:pPr>
-      <w:r>
-        <w:rPr>
-          <w:b/>
-          <w:bCs/>
-        </w:rPr>
-        <w:t>#K2 — Galerie multi-bibliothèques sur anarbib.org (type RebAL)</w:t>
+          <w:lang w:val="pt-BR"/>
+        </w:rPr>
+        <w:t xml:space="preserve"> (i18n, score 6, 1-2h)</w:t>
+      </w:r>
+    </w:p>
+    <w:p>
+      <w:pPr>
+        <w:spacing w:after="120"/>
+      </w:pPr>
+      <w:r>
+        <w:rPr>
+          <w:b/>
+          <w:bCs/>
+        </w:rPr>
+        <w:t xml:space="preserve">#62 — </w:t>
+      </w:r>
+      <w:r>
+        <w:t>Filtres avancés catalogue : année intervalle, ISBN, assunto</w:t>
       </w:r>
       <w:r>
         <w:rPr>
@@ -13740,30 +14018,22 @@
           <w:iCs/>
           <w:color w:val="6B7280"/>
         </w:rPr>
-        <w:t xml:space="preserve"> (Onboarding, score 11, LIVRÉ 21/05/2026)</w:t>
-      </w:r>
-    </w:p>
-    <w:p>
-      <w:pPr>
-        <w:spacing w:after="120"/>
-      </w:pPr>
-      <w:r>
-        <w:rPr>
-          <w:color w:val="4B5563"/>
-        </w:rPr>
-        <w:t>BOUCLÉ 21/05/2026. Galerie type RebAL livrée en 8 langues sur le site anarbib.org (/&lt;lang&gt;/explorar/), intégrée au gabarit du site. Cartes : nom, ville (pointeur vers OPAC), affiliation, volumétrie (notices), badge, boutons 'Voir le catalogue' + 'Site web'. Backend : vue api.public_libraries (security_invoker, lecture anon, scope visibility_level='public'), 2 colonnes additives sur library_commons (affiliation_label, website_url), métadonnées BLMF renseignées. App : route alias /catalogo/:slug pour le scoping mono-bibliothèque (copySearchLink réparé au passage). Onboarding : bandeau vitrine sur /criar-conta pointant vers la galerie. Arbitrage acté : D7 absorbé — la route provisoire /explorar prévue dans la spec criar-conta v0.2 est abandonnée au profit de la vraie galerie. 5 migrations/paquets, 6 langues i18n app + 8 langues site. État réel du réseau au lancement : 1 seule biblio publique exposée (BLMF), la galerie se peuple seule (vitrine vivante).</w:t>
-      </w:r>
-    </w:p>
-    <w:p>
-      <w:pPr>
-        <w:spacing w:after="120"/>
-      </w:pPr>
-      <w:r>
-        <w:rPr>
-          <w:b/>
-          <w:bCs/>
-        </w:rPr>
-        <w:t>#MM3 — Encadrés inline « parlons-en avant » sur pages Biblioteca sensibles</w:t>
+        <w:t xml:space="preserve"> (UX, score 6, 1 session)</w:t>
+      </w:r>
+    </w:p>
+    <w:p>
+      <w:pPr>
+        <w:spacing w:after="120"/>
+      </w:pPr>
+      <w:r>
+        <w:rPr>
+          <w:b/>
+          <w:bCs/>
+        </w:rPr>
+        <w:t xml:space="preserve">#75 — </w:t>
+      </w:r>
+      <w:r>
+        <w:t>Boutons navigation conditionnels selon rôle (audit complet)</w:t>
       </w:r>
       <w:r>
         <w:rPr>
@@ -13771,30 +14041,22 @@
           <w:iCs/>
           <w:color w:val="6B7280"/>
         </w:rPr>
-        <w:t xml:space="preserve"> (Anti-méga-machine, score 11, 2-3h (4 encadrés ciblés + i18n))</w:t>
-      </w:r>
-    </w:p>
-    <w:p>
-      <w:pPr>
-        <w:spacing w:after="120"/>
-      </w:pPr>
-      <w:r>
-        <w:rPr>
-          <w:color w:val="4B5563"/>
-        </w:rPr>
-        <w:t>Pages : gouvernance, profil d'adoption, transitions, regimento. Encadré inline visible (pas un footer générique). Anticipe le scénario où un coordenador est bloqué·e sur une décision configurante.</w:t>
-      </w:r>
-    </w:p>
-    <w:p>
-      <w:pPr>
-        <w:spacing w:after="120"/>
-      </w:pPr>
-      <w:r>
-        <w:rPr>
-          <w:b/>
-          <w:bCs/>
-        </w:rPr>
-        <w:t>#K3 — Rattachement automatique lectrices orphelines (phase 2 Karina)</w:t>
+        <w:t xml:space="preserve"> (UX, score 6, 1-2h)</w:t>
+      </w:r>
+    </w:p>
+    <w:p>
+      <w:pPr>
+        <w:spacing w:after="120"/>
+      </w:pPr>
+      <w:r>
+        <w:rPr>
+          <w:b/>
+          <w:bCs/>
+        </w:rPr>
+        <w:t xml:space="preserve">#OPAC2 — </w:t>
+      </w:r>
+      <w:r>
+        <w:t>Affichage MARC consultable côté OPAC public</w:t>
       </w:r>
       <w:r>
         <w:rPr>
@@ -13802,30 +14064,22 @@
           <w:iCs/>
           <w:color w:val="6B7280"/>
         </w:rPr>
-        <w:t xml:space="preserve"> (Onboarding, score 10, 1 session backend + 1 frontend)</w:t>
-      </w:r>
-    </w:p>
-    <w:p>
-      <w:pPr>
-        <w:spacing w:after="120"/>
-      </w:pPr>
-      <w:r>
-        <w:rPr>
-          <w:color w:val="4B5563"/>
-        </w:rPr>
-        <w:t>Quand biblio mentionnée par lectrice orpheline rejoint AnarBib : claim reader_attachment. Spec dédiée à rédiger (scénarios A/B/C : admin réseau push, /conta pull, ou hybride).</w:t>
-      </w:r>
-    </w:p>
-    <w:p>
-      <w:pPr>
-        <w:spacing w:after="120"/>
-      </w:pPr>
-      <w:r>
-        <w:rPr>
-          <w:b/>
-          <w:bCs/>
-        </w:rPr>
-        <w:t>#MM4 — Page /conversemos : canal humain premier, guides seconds</w:t>
+        <w:t xml:space="preserve"> (OPAC, score 6, 2-3h)</w:t>
+      </w:r>
+    </w:p>
+    <w:p>
+      <w:pPr>
+        <w:spacing w:after="120"/>
+      </w:pPr>
+      <w:r>
+        <w:rPr>
+          <w:b/>
+          <w:bCs/>
+        </w:rPr>
+        <w:t xml:space="preserve">#OPAC4 — </w:t>
+      </w:r>
+      <w:r>
+        <w:t>Onglet 'Documents similaires' avec recommandations contextuelles</w:t>
       </w:r>
       <w:r>
         <w:rPr>
@@ -13833,30 +14087,22 @@
           <w:iCs/>
           <w:color w:val="6B7280"/>
         </w:rPr>
-        <w:t xml:space="preserve"> (Anti-méga-machine, score 10, 3-4h (page complète + routing + i18n × 6 locales))</w:t>
-      </w:r>
-    </w:p>
-    <w:p>
-      <w:pPr>
-        <w:spacing w:after="120"/>
-      </w:pPr>
-      <w:r>
-        <w:rPr>
-          <w:color w:val="4B5563"/>
-        </w:rPr>
-        <w:t>Page courte qui présente AnarBib comme une fédération outillée par un SIGB (pas l'inverse). Doctrine §2.2 exigence 3 : les admins réseau sont des camarades qui partagent la connaissance, pas une hotline.</w:t>
-      </w:r>
-    </w:p>
-    <w:p>
-      <w:pPr>
-        <w:spacing w:after="120"/>
-      </w:pPr>
-      <w:r>
-        <w:rPr>
-          <w:b/>
-          <w:bCs/>
-        </w:rPr>
-        <w:t>#31 — Test E2E parcours lecteur réservation → retrait</w:t>
+        <w:t xml:space="preserve"> (OPAC, score 6, 1-2 sessions)</w:t>
+      </w:r>
+    </w:p>
+    <w:p>
+      <w:pPr>
+        <w:spacing w:after="120"/>
+      </w:pPr>
+      <w:r>
+        <w:rPr>
+          <w:b/>
+          <w:bCs/>
+        </w:rPr>
+        <w:t xml:space="preserve">#OPAC5 — </w:t>
+      </w:r>
+      <w:r>
+        <w:t>Tags lecteurs (folksonomie légère)</w:t>
       </w:r>
       <w:r>
         <w:rPr>
@@ -13864,30 +14110,22 @@
           <w:iCs/>
           <w:color w:val="6B7280"/>
         </w:rPr>
-        <w:t xml:space="preserve"> (Tests, score 9, 1 session)</w:t>
-      </w:r>
-    </w:p>
-    <w:p>
-      <w:pPr>
-        <w:spacing w:after="120"/>
-      </w:pPr>
-      <w:r>
-        <w:rPr>
-          <w:color w:val="4B5563"/>
-        </w:rPr>
-        <w:t>Pendant lecteur de #32.</w:t>
-      </w:r>
-    </w:p>
-    <w:p>
-      <w:pPr>
-        <w:spacing w:after="120"/>
-      </w:pPr>
-      <w:r>
-        <w:rPr>
-          <w:b/>
-          <w:bCs/>
-        </w:rPr>
-        <w:t>#35 — Composant StaffMembershipManager (renouvellements)</w:t>
+        <w:t xml:space="preserve"> (OPAC, score 5, 1 session)</w:t>
+      </w:r>
+    </w:p>
+    <w:p>
+      <w:pPr>
+        <w:spacing w:after="120"/>
+      </w:pPr>
+      <w:r>
+        <w:rPr>
+          <w:b/>
+          <w:bCs/>
+        </w:rPr>
+        <w:t xml:space="preserve">#16 — </w:t>
+      </w:r>
+      <w:r>
+        <w:t>Bundle index 1204 KB : locales i18n chargées statiquement (cause identifiée)</w:t>
       </w:r>
       <w:r>
         <w:rPr>
@@ -13895,30 +14133,30 @@
           <w:iCs/>
           <w:color w:val="6B7280"/>
         </w:rPr>
-        <w:t xml:space="preserve"> (Membership, score 9, 1 session)</w:t>
-      </w:r>
-    </w:p>
-    <w:p>
-      <w:pPr>
-        <w:spacing w:after="120"/>
-      </w:pPr>
-      <w:r>
-        <w:rPr>
-          <w:color w:val="4B5563"/>
-        </w:rPr>
-        <w:t>Lié à #34.</w:t>
-      </w:r>
-    </w:p>
-    <w:p>
-      <w:pPr>
-        <w:spacing w:after="120"/>
-      </w:pPr>
-      <w:r>
-        <w:rPr>
-          <w:b/>
-          <w:bCs/>
-        </w:rPr>
-        <w:t>#4 — Documenter SECURITY DEFINER via COMMENT ON FUNCTION</w:t>
+        <w:t xml:space="preserve"> (Performance, score 7, 1 session dédiée)</w:t>
+      </w:r>
+    </w:p>
+    <w:p>
+      <w:pPr>
+        <w:spacing w:after="120"/>
+      </w:pPr>
+      <w:r>
+        <w:t>Cause identifiée le 20/05 via rollup-plugin-visualizer (treemap). Le chunk index fait 1204 KB (330 KB gzip), pas 947. La moitié de son poids vient des six fichiers de locales (pt-BR, fr, es, en, it, de) chargés statiquement : chaque visiteur·euse télécharge les six langues alors qu'iel n'en affiche qu'une. Le chunking des pages et des vendors est déjà bon (chaque page a son chunk, vendors séparés) — le seul vrai gisement, ce sont les locales. Remède : charger les locales en import() dynamique, ne télécharger &lt;locale&gt;.json qu'à la demande. Touche la logique de chargement des messages react-intl + le LanguagePicker (switch de langue à chaud, devient asynchrone) + gestion d'un état de chargement. À faire en session dédiée, à tête reposée (toucher l'i18n sans filet peut casser l'affichage des traductions partout) ; tester les six langues après. Le rollup-plugin-visualizer est installé en dev (commité avec le chantier chunks) — à retirer une fois l'optimisation faite. Note : l'option manualChunks seule ne ferait que déplacer les locales dans un chunk séparé sans réduire le téléchargement — cosmétique. C'est bien l'import() dynamique qui apporte le gain réel.</w:t>
+      </w:r>
+    </w:p>
+    <w:p>
+      <w:pPr>
+        <w:spacing w:after="120"/>
+      </w:pPr>
+      <w:r>
+        <w:rPr>
+          <w:b/>
+          <w:bCs/>
+        </w:rPr>
+        <w:t xml:space="preserve">#49 — </w:t>
+      </w:r>
+      <w:r>
+        <w:t>Phase 5 i18n : test CI orphelines + clés inutilisées</w:t>
       </w:r>
       <w:r>
         <w:rPr>
@@ -13926,30 +14164,22 @@
           <w:iCs/>
           <w:color w:val="6B7280"/>
         </w:rPr>
-        <w:t xml:space="preserve"> (Sécurité, score 9, 2-3 sessions)</w:t>
-      </w:r>
-    </w:p>
-    <w:p>
-      <w:pPr>
-        <w:spacing w:after="120"/>
-      </w:pPr>
-      <w:r>
-        <w:rPr>
-          <w:color w:val="4B5563"/>
-        </w:rPr>
-        <w:t>Reste 80 fonctions. Distinct de #150 (qui isole ACL sans toucher COMMENT).</w:t>
-      </w:r>
-    </w:p>
-    <w:p>
-      <w:pPr>
-        <w:spacing w:after="120"/>
-      </w:pPr>
-      <w:r>
-        <w:rPr>
-          <w:b/>
-          <w:bCs/>
-        </w:rPr>
-        <w:t>#64 — Page Rede : vue réseau fédératif des biblios</w:t>
+        <w:t xml:space="preserve"> (i18n, score 4, 1-2h)</w:t>
+      </w:r>
+    </w:p>
+    <w:p>
+      <w:pPr>
+        <w:spacing w:after="120"/>
+      </w:pPr>
+      <w:r>
+        <w:rPr>
+          <w:b/>
+          <w:bCs/>
+        </w:rPr>
+        <w:t xml:space="preserve">#81 — </w:t>
+      </w:r>
+      <w:r>
+        <w:t>Audit défense-en-profondeur Cat 2 : ~30 fonctions calcul pur</w:t>
       </w:r>
       <w:r>
         <w:rPr>
@@ -13957,30 +14187,22 @@
           <w:iCs/>
           <w:color w:val="6B7280"/>
         </w:rPr>
-        <w:t xml:space="preserve"> (Réseau, score 9, 1-2 sessions)</w:t>
-      </w:r>
-    </w:p>
-    <w:p>
-      <w:pPr>
-        <w:spacing w:after="120"/>
-      </w:pPr>
-      <w:r>
-        <w:rPr>
-          <w:color w:val="4B5563"/>
-        </w:rPr>
-        <w:t>Vitrine interne (différente de la galerie publique K2).</w:t>
-      </w:r>
-    </w:p>
-    <w:p>
-      <w:pPr>
-        <w:spacing w:after="120"/>
-      </w:pPr>
-      <w:r>
-        <w:rPr>
-          <w:b/>
-          <w:bCs/>
-        </w:rPr>
-        <w:t>#OPAC1 — Barre d'actions de notice : citer / mail / imprimer / exporter / permalien</w:t>
+        <w:t xml:space="preserve"> (Sécurité, score 4, 1 session)</w:t>
+      </w:r>
+    </w:p>
+    <w:p>
+      <w:pPr>
+        <w:spacing w:after="120"/>
+      </w:pPr>
+      <w:r>
+        <w:rPr>
+          <w:b/>
+          <w:bCs/>
+        </w:rPr>
+        <w:t xml:space="preserve">#148 — </w:t>
+      </w:r>
+      <w:r>
+        <w:t>Supprimer/renommer AnarBib-functions/ obsolète</w:t>
       </w:r>
       <w:r>
         <w:rPr>
@@ -13988,30 +14210,22 @@
           <w:iCs/>
           <w:color w:val="6B7280"/>
         </w:rPr>
-        <w:t xml:space="preserve"> (OPAC, score 9, 1 session)</w:t>
-      </w:r>
-    </w:p>
-    <w:p>
-      <w:pPr>
-        <w:spacing w:after="120"/>
-      </w:pPr>
-      <w:r>
-        <w:rPr>
-          <w:color w:val="4B5563"/>
-        </w:rPr>
-        <w:t>Citer (APA/Chicago/MLA), envoyer par courriel, imprimer, exporter (BibTeX/RIS/MARC), permalien stable. Inspiré RebAL. Utile pour usage chercheur·euses et militant·es documenté·es.</w:t>
-      </w:r>
-    </w:p>
-    <w:p>
-      <w:pPr>
-        <w:spacing w:after="120"/>
-      </w:pPr>
-      <w:r>
-        <w:rPr>
-          <w:b/>
-          <w:bCs/>
-        </w:rPr>
-        <w:t>#OPAC3 — Liens autorités systématiques sur tous les contributeurs</w:t>
+        <w:t xml:space="preserve"> (Hygiène, score 3, 5 min)</w:t>
+      </w:r>
+    </w:p>
+    <w:p>
+      <w:pPr>
+        <w:spacing w:after="120"/>
+      </w:pPr>
+      <w:r>
+        <w:rPr>
+          <w:b/>
+          <w:bCs/>
+        </w:rPr>
+        <w:t xml:space="preserve">#22 — </w:t>
+      </w:r>
+      <w:r>
+        <w:t>fn_submit_library_request_via_claim : COALESCE sur user_id</w:t>
       </w:r>
       <w:r>
         <w:rPr>
@@ -14019,40 +14233,22 @@
           <w:iCs/>
           <w:color w:val="6B7280"/>
         </w:rPr>
-        <w:t xml:space="preserve"> (OPAC, score 9, 1 session)</w:t>
-      </w:r>
-    </w:p>
-    <w:p>
-      <w:pPr>
-        <w:spacing w:after="120"/>
-        <w:rPr>
-          <w:lang w:val="en-US"/>
-        </w:rPr>
-      </w:pPr>
-      <w:r>
-        <w:rPr>
-          <w:color w:val="4B5563"/>
-        </w:rPr>
-        <w:t xml:space="preserve">Auteur principal + tous co-auteurs/traducteurs/illustrateurs cliquables vers fiche autorité. </w:t>
-      </w:r>
-      <w:r>
-        <w:rPr>
-          <w:color w:val="4B5563"/>
-          <w:lang w:val="en-US"/>
-        </w:rPr>
-        <w:t>Fondation existe (authors, book_contributors, link_author_to_book_contributors).</w:t>
-      </w:r>
-    </w:p>
-    <w:p>
-      <w:pPr>
-        <w:spacing w:after="120"/>
-      </w:pPr>
-      <w:r>
-        <w:rPr>
-          <w:b/>
-          <w:bCs/>
-        </w:rPr>
-        <w:t>#115 — Code-split PanelPage.jsx (~2300 lignes après #143)</w:t>
+        <w:t xml:space="preserve"> (Cotisations, score 3, 15 min)</w:t>
+      </w:r>
+    </w:p>
+    <w:p>
+      <w:pPr>
+        <w:spacing w:after="120"/>
+      </w:pPr>
+      <w:r>
+        <w:rPr>
+          <w:b/>
+          <w:bCs/>
+        </w:rPr>
+        <w:t xml:space="preserve">#43 — </w:t>
+      </w:r>
+      <w:r>
+        <w:t>Notifications devolução tardive</w:t>
       </w:r>
       <w:r>
         <w:rPr>
@@ -14060,30 +14256,22 @@
           <w:iCs/>
           <w:color w:val="6B7280"/>
         </w:rPr>
-        <w:t xml:space="preserve"> (Performance, score 8, 2-3h)</w:t>
-      </w:r>
-    </w:p>
-    <w:p>
-      <w:pPr>
-        <w:spacing w:after="120"/>
-      </w:pPr>
-      <w:r>
-        <w:rPr>
-          <w:color w:val="4B5563"/>
-        </w:rPr>
-        <w:t>Warning Vite &gt; 500KB persistant. AccountPage aussi (#13).</w:t>
-      </w:r>
-    </w:p>
-    <w:p>
-      <w:pPr>
-        <w:spacing w:after="120"/>
-      </w:pPr>
-      <w:r>
-        <w:rPr>
-          <w:b/>
-          <w:bCs/>
-        </w:rPr>
-        <w:t>#119 — Audit secrets : tokens Codeberg, Woodpecker, Windows Cred Mgr</w:t>
+        <w:t xml:space="preserve"> (Notifications, score 3, 1-2h)</w:t>
+      </w:r>
+    </w:p>
+    <w:p>
+      <w:pPr>
+        <w:spacing w:after="120"/>
+      </w:pPr>
+      <w:r>
+        <w:rPr>
+          <w:b/>
+          <w:bCs/>
+        </w:rPr>
+        <w:t xml:space="preserve">#7 — </w:t>
+      </w:r>
+      <w:r>
+        <w:t>Top books 90-day data chargé mais non rendu UI</w:t>
       </w:r>
       <w:r>
         <w:rPr>
@@ -14091,42 +14279,22 @@
           <w:iCs/>
           <w:color w:val="6B7280"/>
         </w:rPr>
-        <w:t xml:space="preserve"> (Hygiène, score 8, 2-3h)</w:t>
-      </w:r>
-    </w:p>
-    <w:p>
-      <w:pPr>
-        <w:spacing w:after="120"/>
-      </w:pPr>
-      <w:r>
-        <w:rPr>
-          <w:color w:val="4B5563"/>
-        </w:rPr>
-        <w:t>Local auth break régulier.</w:t>
-      </w:r>
-    </w:p>
-    <w:p>
-      <w:pPr>
-        <w:spacing w:after="120"/>
-      </w:pPr>
-      <w:r>
-        <w:rPr>
-          <w:color w:val="4B5563"/>
-        </w:rPr>
-        <w:t>Ajout 21/05 — à intégrer au périmètre de cet audit : le secret WEBHOOK_SECRET_NOTIFY_INTERNAL_TASK a été rotaté le 21/05 pendant la session R.3 (l’ancienne valeur était introuvable, écart constaté par comparaison de digest SHA-256 ; nouvelle valeur = 32 octets base64, posée via « supabase secrets set »). Conséquence à traiter : le webhook Postgres qui déclenche notify-internal-task continue d’envoyer l’ancienne valeur — il devra être mis en cohérence avec la nouvelle avant toute mise en service réelle des notifications de tâches internes, sinon elles tomberaient en 401. Sans effet aujourd’hui (rien en production réelle), mais à ne pas oublier.</w:t>
-      </w:r>
-    </w:p>
-    <w:p>
-      <w:pPr>
-        <w:spacing w:after="120"/>
-      </w:pPr>
-      <w:r>
-        <w:rPr>
-          <w:b/>
-          <w:bCs/>
-        </w:rPr>
-        <w:lastRenderedPageBreak/>
-        <w:t>#149 — Pattern erreurs RPC silencieuses (audit + helper)</w:t>
+        <w:t xml:space="preserve"> (Bugs UX, score 3, 30 min)</w:t>
+      </w:r>
+    </w:p>
+    <w:p>
+      <w:pPr>
+        <w:spacing w:after="120"/>
+      </w:pPr>
+      <w:r>
+        <w:rPr>
+          <w:b/>
+          <w:bCs/>
+        </w:rPr>
+        <w:t xml:space="preserve">#70 — </w:t>
+      </w:r>
+      <w:r>
+        <w:t>Manuel complet AnarBib : versions traduites (URL i18n)</w:t>
       </w:r>
       <w:r>
         <w:rPr>
@@ -14134,40 +14302,22 @@
           <w:iCs/>
           <w:color w:val="6B7280"/>
         </w:rPr>
-        <w:t xml:space="preserve"> (Hygiène, score 8, 2-3h)</w:t>
-      </w:r>
-    </w:p>
-    <w:p>
-      <w:pPr>
-        <w:spacing w:after="120"/>
-        <w:rPr>
-          <w:lang w:val="en-US"/>
-        </w:rPr>
-      </w:pPr>
-      <w:r>
-        <w:rPr>
-          <w:color w:val="4B5563"/>
-        </w:rPr>
-        <w:t xml:space="preserve">Bug #132 type : console.error sans feedback UI. </w:t>
-      </w:r>
-      <w:r>
-        <w:rPr>
-          <w:color w:val="4B5563"/>
-          <w:lang w:val="en-US"/>
-        </w:rPr>
-        <w:t>Helper handleRpcError(err) + toast/banner.</w:t>
-      </w:r>
-    </w:p>
-    <w:p>
-      <w:pPr>
-        <w:spacing w:after="120"/>
-      </w:pPr>
-      <w:r>
-        <w:rPr>
-          <w:b/>
-          <w:bCs/>
-        </w:rPr>
-        <w:t>#20 — must_change_password : enforcement réel au login manquant</w:t>
+        <w:t xml:space="preserve"> (i18n, score 3, 1-2h)</w:t>
+      </w:r>
+    </w:p>
+    <w:p>
+      <w:pPr>
+        <w:spacing w:after="120"/>
+      </w:pPr>
+      <w:r>
+        <w:rPr>
+          <w:b/>
+          <w:bCs/>
+        </w:rPr>
+        <w:t xml:space="preserve">#8 — </w:t>
+      </w:r>
+      <w:r>
+        <w:t>Hardcoded PT-BR strings dans Rapports</w:t>
       </w:r>
       <w:r>
         <w:rPr>
@@ -14175,30 +14325,22 @@
           <w:iCs/>
           <w:color w:val="6B7280"/>
         </w:rPr>
-        <w:t xml:space="preserve"> (Sécurité, score 8, 1-2h)</w:t>
-      </w:r>
-    </w:p>
-    <w:p>
-      <w:pPr>
-        <w:spacing w:after="120"/>
-      </w:pPr>
-      <w:r>
-        <w:rPr>
-          <w:color w:val="4B5563"/>
-        </w:rPr>
-        <w:t>Affiché dans PanelPage mais pas bloqué au login.</w:t>
-      </w:r>
-    </w:p>
-    <w:p>
-      <w:pPr>
-        <w:spacing w:after="120"/>
-      </w:pPr>
-      <w:r>
-        <w:rPr>
-          <w:b/>
-          <w:bCs/>
-        </w:rPr>
-        <w:t>#25 — Notifications expiration cotisation (7j, 1j, jour J)</w:t>
+        <w:t xml:space="preserve"> (Bugs UX, score 3, 30 min)</w:t>
+      </w:r>
+    </w:p>
+    <w:p>
+      <w:pPr>
+        <w:spacing w:after="120"/>
+      </w:pPr>
+      <w:r>
+        <w:rPr>
+          <w:b/>
+          <w:bCs/>
+        </w:rPr>
+        <w:t xml:space="preserve">#146 — </w:t>
+      </w:r>
+      <w:r>
+        <w:t>Désactiver GitHub Pages (miroir inutile)</w:t>
       </w:r>
       <w:r>
         <w:rPr>
@@ -14206,30 +14348,22 @@
           <w:iCs/>
           <w:color w:val="6B7280"/>
         </w:rPr>
-        <w:t xml:space="preserve"> (Cotisations, score 8, 2-3h)</w:t>
-      </w:r>
-    </w:p>
-    <w:p>
-      <w:pPr>
-        <w:spacing w:after="120"/>
-      </w:pPr>
-      <w:r>
-        <w:rPr>
-          <w:color w:val="4B5563"/>
-        </w:rPr>
-        <w:t>Après bouclage #33/#36.</w:t>
-      </w:r>
-    </w:p>
-    <w:p>
-      <w:pPr>
-        <w:spacing w:after="120"/>
-      </w:pPr>
-      <w:r>
-        <w:rPr>
-          <w:b/>
-          <w:bCs/>
-        </w:rPr>
-        <w:t>#6 — (nulld, nullx) pour règles circulation non-renouvelables</w:t>
+        <w:t xml:space="preserve"> (Hygiène, score 2, 5 min)</w:t>
+      </w:r>
+    </w:p>
+    <w:p>
+      <w:pPr>
+        <w:spacing w:after="120"/>
+      </w:pPr>
+      <w:r>
+        <w:rPr>
+          <w:b/>
+          <w:bCs/>
+        </w:rPr>
+        <w:t xml:space="preserve">#17 — </w:t>
+      </w:r>
+      <w:r>
+        <w:t>Nettoyage 566 clés i18n orphelines</w:t>
       </w:r>
       <w:r>
         <w:rPr>
@@ -14237,30 +14371,22 @@
           <w:iCs/>
           <w:color w:val="6B7280"/>
         </w:rPr>
-        <w:t xml:space="preserve"> (Bugs UX, score 8, 1h)</w:t>
-      </w:r>
-    </w:p>
-    <w:p>
-      <w:pPr>
-        <w:spacing w:after="120"/>
-      </w:pPr>
-      <w:r>
-        <w:rPr>
-          <w:color w:val="4B5563"/>
-        </w:rPr>
-        <w:t>À conditionner par circulation_mode.</w:t>
-      </w:r>
-    </w:p>
-    <w:p>
-      <w:pPr>
-        <w:spacing w:after="120"/>
-      </w:pPr>
-      <w:r>
-        <w:rPr>
-          <w:b/>
-          <w:bCs/>
-        </w:rPr>
-        <w:t>#OPAC6 — Onglet 'Description' avec résumé/notes/sujets bien structuré</w:t>
+        <w:t xml:space="preserve"> (i18n, score 2, 1 session passe dédiée)</w:t>
+      </w:r>
+    </w:p>
+    <w:p>
+      <w:pPr>
+        <w:spacing w:after="120"/>
+      </w:pPr>
+      <w:r>
+        <w:rPr>
+          <w:b/>
+          <w:bCs/>
+        </w:rPr>
+        <w:t xml:space="preserve">#26 — </w:t>
+      </w:r>
+      <w:r>
+        <w:t>4 tables _backup_*_20260408 toujours en prod</w:t>
       </w:r>
       <w:r>
         <w:rPr>
@@ -14268,72 +14394,7 @@
           <w:iCs/>
           <w:color w:val="6B7280"/>
         </w:rPr>
-        <w:t xml:space="preserve"> (OPAC, score 8, 0.5-1 session)</w:t>
-      </w:r>
-    </w:p>
-    <w:p>
-      <w:pPr>
-        <w:spacing w:after="120"/>
-      </w:pPr>
-      <w:r>
-        <w:rPr>
-          <w:color w:val="4B5563"/>
-        </w:rPr>
-        <w:t>Champ description riche dans book_drafts, à exposer en onglet dédié sur livro.html.</w:t>
-      </w:r>
-    </w:p>
-    <w:p>
-      <w:pPr>
-        <w:pStyle w:val="Titre2"/>
-      </w:pPr>
-      <w:r>
-        <w:t>Nice-to-have (≤ 7) — 25 items</w:t>
-      </w:r>
-    </w:p>
-    <w:p>
-      <w:pPr>
-        <w:spacing w:after="120"/>
-      </w:pPr>
-      <w:r>
-        <w:rPr>
-          <w:b/>
-          <w:bCs/>
-        </w:rPr>
-        <w:t xml:space="preserve">#147 — </w:t>
-      </w:r>
-      <w:r>
-        <w:t>LanguagePicker : retirer drapeaux d'États, noms en langue propre</w:t>
-      </w:r>
-      <w:r>
-        <w:rPr>
-          <w:i/>
-          <w:iCs/>
-          <w:color w:val="6B7280"/>
-        </w:rPr>
-        <w:t xml:space="preserve"> (i18n, score 7, 1h)</w:t>
-      </w:r>
-    </w:p>
-    <w:p>
-      <w:pPr>
-        <w:spacing w:after="120"/>
-      </w:pPr>
-      <w:r>
-        <w:rPr>
-          <w:b/>
-          <w:bCs/>
-        </w:rPr>
-        <w:t xml:space="preserve">#13 — </w:t>
-      </w:r>
-      <w:r>
-        <w:t>Code-split AccountPage.jsx (~1400 lignes)</w:t>
-      </w:r>
-      <w:r>
-        <w:rPr>
-          <w:i/>
-          <w:iCs/>
-          <w:color w:val="6B7280"/>
-        </w:rPr>
-        <w:t xml:space="preserve"> (Performance, score 6, 2-3h)</w:t>
+        <w:t xml:space="preserve"> (Maintenance, score 2, 10 min)</w:t>
       </w:r>
     </w:p>
     <w:p>
@@ -14349,13 +14410,13 @@
           <w:bCs/>
           <w:lang w:val="en-US"/>
         </w:rPr>
-        <w:t xml:space="preserve">#34 — </w:t>
+        <w:t xml:space="preserve">#78 — </w:t>
       </w:r>
       <w:r>
         <w:rPr>
           <w:lang w:val="en-US"/>
         </w:rPr>
-        <w:t>Composant ReaderMembershipBadge (statut lecteur)</w:t>
+        <w:t>Nettoyer hook stub link_book_contributors_to_authors</w:t>
       </w:r>
       <w:r>
         <w:rPr>
@@ -14364,467 +14425,6 @@
           <w:color w:val="6B7280"/>
           <w:lang w:val="en-US"/>
         </w:rPr>
-        <w:t xml:space="preserve"> (Membership, score 6, 1-2h)</w:t>
-      </w:r>
-    </w:p>
-    <w:p>
-      <w:pPr>
-        <w:spacing w:after="120"/>
-        <w:rPr>
-          <w:lang w:val="pt-BR"/>
-        </w:rPr>
-      </w:pPr>
-      <w:r>
-        <w:rPr>
-          <w:b/>
-          <w:bCs/>
-          <w:lang w:val="pt-BR"/>
-        </w:rPr>
-        <w:t xml:space="preserve">#51 — </w:t>
-      </w:r>
-      <w:r>
-        <w:rPr>
-          <w:lang w:val="pt-BR"/>
-        </w:rPr>
-        <w:t>ReaderPage i18n (0 occurrence confirmée)</w:t>
-      </w:r>
-      <w:r>
-        <w:rPr>
-          <w:i/>
-          <w:iCs/>
-          <w:color w:val="6B7280"/>
-          <w:lang w:val="pt-BR"/>
-        </w:rPr>
-        <w:t xml:space="preserve"> (i18n, score 6, 1-2h)</w:t>
-      </w:r>
-    </w:p>
-    <w:p>
-      <w:pPr>
-        <w:spacing w:after="120"/>
-      </w:pPr>
-      <w:r>
-        <w:rPr>
-          <w:b/>
-          <w:bCs/>
-        </w:rPr>
-        <w:t xml:space="preserve">#62 — </w:t>
-      </w:r>
-      <w:r>
-        <w:t>Filtres avancés catalogue : année intervalle, ISBN, assunto</w:t>
-      </w:r>
-      <w:r>
-        <w:rPr>
-          <w:i/>
-          <w:iCs/>
-          <w:color w:val="6B7280"/>
-        </w:rPr>
-        <w:t xml:space="preserve"> (UX, score 6, 1 session)</w:t>
-      </w:r>
-    </w:p>
-    <w:p>
-      <w:pPr>
-        <w:spacing w:after="120"/>
-      </w:pPr>
-      <w:r>
-        <w:rPr>
-          <w:b/>
-          <w:bCs/>
-        </w:rPr>
-        <w:t xml:space="preserve">#75 — </w:t>
-      </w:r>
-      <w:r>
-        <w:t>Boutons navigation conditionnels selon rôle (audit complet)</w:t>
-      </w:r>
-      <w:r>
-        <w:rPr>
-          <w:i/>
-          <w:iCs/>
-          <w:color w:val="6B7280"/>
-        </w:rPr>
-        <w:t xml:space="preserve"> (UX, score 6, 1-2h)</w:t>
-      </w:r>
-    </w:p>
-    <w:p>
-      <w:pPr>
-        <w:spacing w:after="120"/>
-      </w:pPr>
-      <w:r>
-        <w:rPr>
-          <w:b/>
-          <w:bCs/>
-        </w:rPr>
-        <w:t xml:space="preserve">#OPAC2 — </w:t>
-      </w:r>
-      <w:r>
-        <w:t>Affichage MARC consultable côté OPAC public</w:t>
-      </w:r>
-      <w:r>
-        <w:rPr>
-          <w:i/>
-          <w:iCs/>
-          <w:color w:val="6B7280"/>
-        </w:rPr>
-        <w:t xml:space="preserve"> (OPAC, score 6, 2-3h)</w:t>
-      </w:r>
-    </w:p>
-    <w:p>
-      <w:pPr>
-        <w:spacing w:after="120"/>
-      </w:pPr>
-      <w:r>
-        <w:rPr>
-          <w:b/>
-          <w:bCs/>
-        </w:rPr>
-        <w:t xml:space="preserve">#OPAC4 — </w:t>
-      </w:r>
-      <w:r>
-        <w:t>Onglet 'Documents similaires' avec recommandations contextuelles</w:t>
-      </w:r>
-      <w:r>
-        <w:rPr>
-          <w:i/>
-          <w:iCs/>
-          <w:color w:val="6B7280"/>
-        </w:rPr>
-        <w:t xml:space="preserve"> (OPAC, score 6, 1-2 sessions)</w:t>
-      </w:r>
-    </w:p>
-    <w:p>
-      <w:pPr>
-        <w:spacing w:after="120"/>
-      </w:pPr>
-      <w:r>
-        <w:rPr>
-          <w:b/>
-          <w:bCs/>
-        </w:rPr>
-        <w:t xml:space="preserve">#OPAC5 — </w:t>
-      </w:r>
-      <w:r>
-        <w:t>Tags lecteurs (folksonomie légère)</w:t>
-      </w:r>
-      <w:r>
-        <w:rPr>
-          <w:i/>
-          <w:iCs/>
-          <w:color w:val="6B7280"/>
-        </w:rPr>
-        <w:t xml:space="preserve"> (OPAC, score 5, 1 session)</w:t>
-      </w:r>
-    </w:p>
-    <w:p>
-      <w:pPr>
-        <w:spacing w:after="120"/>
-      </w:pPr>
-      <w:r>
-        <w:rPr>
-          <w:b/>
-          <w:bCs/>
-        </w:rPr>
-        <w:t xml:space="preserve">#16 — </w:t>
-      </w:r>
-      <w:r>
-        <w:t>Bundle index 1204 KB : locales i18n chargées statiquement (cause identifiée)</w:t>
-      </w:r>
-      <w:r>
-        <w:rPr>
-          <w:i/>
-          <w:iCs/>
-          <w:color w:val="6B7280"/>
-        </w:rPr>
-        <w:t xml:space="preserve"> (Performance, score 7, 1 session dédiée)</w:t>
-      </w:r>
-    </w:p>
-    <w:p>
-      <w:pPr>
-        <w:spacing w:after="120"/>
-      </w:pPr>
-      <w:r>
-        <w:t xml:space="preserve">Cause identifiée le 20/05 via rollup-plugin-visualizer (treemap). Le chunk index fait 1204 KB (330 KB gzip), pas 947. La moitié de son poids vient des six fichiers de locales (pt-BR, fr, es, en, it, de) chargés statiquement : chaque visiteur·euse télécharge les six langues alors qu'iel n'en affiche qu'une. Le chunking des pages et des vendors est déjà bon (chaque page a son chunk, vendors séparés) — le seul vrai gisement, ce sont les locales. Remède : charger les locales en import() dynamique, ne télécharger &lt;locale&gt;.json qu'à la demande. Touche la logique de chargement des messages react-intl + le LanguagePicker (switch de langue à chaud, devient asynchrone) + gestion d'un état de chargement. À faire en session dédiée, à tête reposée (toucher l'i18n sans filet peut casser l'affichage des traductions partout) ; tester les six langues après. Le rollup-plugin-visualizer est installé en dev (commité avec le chantier chunks) — à retirer une fois l'optimisation faite. Note : l'option manualChunks seule ne ferait que déplacer les locales dans un chunk séparé sans réduire le téléchargement — cosmétique. C'est bien l'import() dynamique qui apporte le gain réel.</w:t>
-      </w:r>
-    </w:p>
-    <w:p>
-      <w:pPr>
-        <w:spacing w:after="120"/>
-      </w:pPr>
-      <w:r>
-        <w:rPr>
-          <w:b/>
-          <w:bCs/>
-        </w:rPr>
-        <w:t xml:space="preserve">#49 — </w:t>
-      </w:r>
-      <w:r>
-        <w:t>Phase 5 i18n : test CI orphelines + clés inutilisées</w:t>
-      </w:r>
-      <w:r>
-        <w:rPr>
-          <w:i/>
-          <w:iCs/>
-          <w:color w:val="6B7280"/>
-        </w:rPr>
-        <w:t xml:space="preserve"> (i18n, score 4, 1-2h)</w:t>
-      </w:r>
-    </w:p>
-    <w:p>
-      <w:pPr>
-        <w:spacing w:after="120"/>
-      </w:pPr>
-      <w:r>
-        <w:rPr>
-          <w:b/>
-          <w:bCs/>
-        </w:rPr>
-        <w:t xml:space="preserve">#81 — </w:t>
-      </w:r>
-      <w:r>
-        <w:t>Audit défense-en-profondeur Cat 2 : ~30 fonctions calcul pur</w:t>
-      </w:r>
-      <w:r>
-        <w:rPr>
-          <w:i/>
-          <w:iCs/>
-          <w:color w:val="6B7280"/>
-        </w:rPr>
-        <w:t xml:space="preserve"> (Sécurité, score 4, 1 session)</w:t>
-      </w:r>
-    </w:p>
-    <w:p>
-      <w:pPr>
-        <w:spacing w:after="120"/>
-      </w:pPr>
-      <w:r>
-        <w:rPr>
-          <w:b/>
-          <w:bCs/>
-        </w:rPr>
-        <w:t xml:space="preserve">#148 — </w:t>
-      </w:r>
-      <w:r>
-        <w:t>Supprimer/renommer AnarBib-functions/ obsolète</w:t>
-      </w:r>
-      <w:r>
-        <w:rPr>
-          <w:i/>
-          <w:iCs/>
-          <w:color w:val="6B7280"/>
-        </w:rPr>
-        <w:t xml:space="preserve"> (Hygiène, score 3, 5 min)</w:t>
-      </w:r>
-    </w:p>
-    <w:p>
-      <w:pPr>
-        <w:spacing w:after="120"/>
-      </w:pPr>
-      <w:r>
-        <w:rPr>
-          <w:b/>
-          <w:bCs/>
-        </w:rPr>
-        <w:t xml:space="preserve">#22 — </w:t>
-      </w:r>
-      <w:r>
-        <w:t>fn_submit_library_request_via_claim : COALESCE sur user_id</w:t>
-      </w:r>
-      <w:r>
-        <w:rPr>
-          <w:i/>
-          <w:iCs/>
-          <w:color w:val="6B7280"/>
-        </w:rPr>
-        <w:t xml:space="preserve"> (Cotisations, score 3, 15 min)</w:t>
-      </w:r>
-    </w:p>
-    <w:p>
-      <w:pPr>
-        <w:spacing w:after="120"/>
-      </w:pPr>
-      <w:r>
-        <w:rPr>
-          <w:b/>
-          <w:bCs/>
-        </w:rPr>
-        <w:t xml:space="preserve">#43 — </w:t>
-      </w:r>
-      <w:r>
-        <w:t>Notifications devolução tardive</w:t>
-      </w:r>
-      <w:r>
-        <w:rPr>
-          <w:i/>
-          <w:iCs/>
-          <w:color w:val="6B7280"/>
-        </w:rPr>
-        <w:t xml:space="preserve"> (Notifications, score 3, 1-2h)</w:t>
-      </w:r>
-    </w:p>
-    <w:p>
-      <w:pPr>
-        <w:spacing w:after="120"/>
-      </w:pPr>
-      <w:r>
-        <w:rPr>
-          <w:b/>
-          <w:bCs/>
-        </w:rPr>
-        <w:t xml:space="preserve">#7 — </w:t>
-      </w:r>
-      <w:r>
-        <w:t>Top books 90-day data chargé mais non rendu UI</w:t>
-      </w:r>
-      <w:r>
-        <w:rPr>
-          <w:i/>
-          <w:iCs/>
-          <w:color w:val="6B7280"/>
-        </w:rPr>
-        <w:t xml:space="preserve"> (Bugs UX, score 3, 30 min)</w:t>
-      </w:r>
-    </w:p>
-    <w:p>
-      <w:pPr>
-        <w:spacing w:after="120"/>
-      </w:pPr>
-      <w:r>
-        <w:rPr>
-          <w:b/>
-          <w:bCs/>
-        </w:rPr>
-        <w:t xml:space="preserve">#70 — </w:t>
-      </w:r>
-      <w:r>
-        <w:t>Manuel complet AnarBib : versions traduites (URL i18n)</w:t>
-      </w:r>
-      <w:r>
-        <w:rPr>
-          <w:i/>
-          <w:iCs/>
-          <w:color w:val="6B7280"/>
-        </w:rPr>
-        <w:t xml:space="preserve"> (i18n, score 3, 1-2h)</w:t>
-      </w:r>
-    </w:p>
-    <w:p>
-      <w:pPr>
-        <w:spacing w:after="120"/>
-      </w:pPr>
-      <w:r>
-        <w:rPr>
-          <w:b/>
-          <w:bCs/>
-        </w:rPr>
-        <w:t xml:space="preserve">#8 — </w:t>
-      </w:r>
-      <w:r>
-        <w:t>Hardcoded PT-BR strings dans Rapports</w:t>
-      </w:r>
-      <w:r>
-        <w:rPr>
-          <w:i/>
-          <w:iCs/>
-          <w:color w:val="6B7280"/>
-        </w:rPr>
-        <w:t xml:space="preserve"> (Bugs UX, score 3, 30 min)</w:t>
-      </w:r>
-    </w:p>
-    <w:p>
-      <w:pPr>
-        <w:spacing w:after="120"/>
-      </w:pPr>
-      <w:r>
-        <w:rPr>
-          <w:b/>
-          <w:bCs/>
-        </w:rPr>
-        <w:t xml:space="preserve">#146 — </w:t>
-      </w:r>
-      <w:r>
-        <w:t>Désactiver GitHub Pages (miroir inutile)</w:t>
-      </w:r>
-      <w:r>
-        <w:rPr>
-          <w:i/>
-          <w:iCs/>
-          <w:color w:val="6B7280"/>
-        </w:rPr>
-        <w:t xml:space="preserve"> (Hygiène, score 2, 5 min)</w:t>
-      </w:r>
-    </w:p>
-    <w:p>
-      <w:pPr>
-        <w:spacing w:after="120"/>
-      </w:pPr>
-      <w:r>
-        <w:rPr>
-          <w:b/>
-          <w:bCs/>
-        </w:rPr>
-        <w:t xml:space="preserve">#17 — </w:t>
-      </w:r>
-      <w:r>
-        <w:t>Nettoyage 566 clés i18n orphelines</w:t>
-      </w:r>
-      <w:r>
-        <w:rPr>
-          <w:i/>
-          <w:iCs/>
-          <w:color w:val="6B7280"/>
-        </w:rPr>
-        <w:t xml:space="preserve"> (i18n, score 2, 1 session passe dédiée)</w:t>
-      </w:r>
-    </w:p>
-    <w:p>
-      <w:pPr>
-        <w:spacing w:after="120"/>
-      </w:pPr>
-      <w:r>
-        <w:rPr>
-          <w:b/>
-          <w:bCs/>
-        </w:rPr>
-        <w:t xml:space="preserve">#26 — </w:t>
-      </w:r>
-      <w:r>
-        <w:t>4 tables _backup_*_20260408 toujours en prod</w:t>
-      </w:r>
-      <w:r>
-        <w:rPr>
-          <w:i/>
-          <w:iCs/>
-          <w:color w:val="6B7280"/>
-        </w:rPr>
-        <w:t xml:space="preserve"> (Maintenance, score 2, 10 min)</w:t>
-      </w:r>
-    </w:p>
-    <w:p>
-      <w:pPr>
-        <w:spacing w:after="120"/>
-        <w:rPr>
-          <w:lang w:val="en-US"/>
-        </w:rPr>
-      </w:pPr>
-      <w:r>
-        <w:rPr>
-          <w:b/>
-          <w:bCs/>
-          <w:lang w:val="en-US"/>
-        </w:rPr>
-        <w:t xml:space="preserve">#78 — </w:t>
-      </w:r>
-      <w:r>
-        <w:rPr>
-          <w:lang w:val="en-US"/>
-        </w:rPr>
-        <w:t>Nettoyer hook stub link_book_contributors_to_authors</w:t>
-      </w:r>
-      <w:r>
-        <w:rPr>
-          <w:i/>
-          <w:iCs/>
-          <w:color w:val="6B7280"/>
-          <w:lang w:val="en-US"/>
-        </w:rPr>
         <w:t xml:space="preserve"> (Hygiène, score 2, 30 min)</w:t>
       </w:r>
     </w:p>
@@ -14933,7 +14533,7 @@
         <w:spacing w:after="120"/>
       </w:pPr>
       <w:r>
-        <w:t xml:space="preserve">Constat du 20/05, en marge du fix du compteur DOCUMENTOS. La page Biblioteca affiche un compteur AUTORIDADES. Or une autorité (auteur∙rice) est par nature trans-bibliothèques : Kropotkine est le même pour tout le réseau, et la table authors n’a d’ailleurs pas de colonne library_id. Un compteur d’autorités n’a de sens réel qu’au niveau réseau, pas dans une page de périmètre local. Deux issues à arbitrer : (a) retirer ce compteur de la page Biblioteca et le porter au niveau Rede ; (b) le redéfinir comme « autorités dont cette biblio détient au moins un ouvrage » (jointure authors vers book_authors vers holdings scopés). Décision de conception, pas un fix deux lignes. À noter : la ligne du frontend fait actuellement count(*) sur authors sans filtre, comportement intrinsèquement global tant que le schéma n’a pas de library_id sur authors.</w:t>
+        <w:t>Constat du 20/05, en marge du fix du compteur DOCUMENTOS. La page Biblioteca affiche un compteur AUTORIDADES. Or une autorité (auteur∙rice) est par nature trans-bibliothèques : Kropotkine est le même pour tout le réseau, et la table authors n’a d’ailleurs pas de colonne library_id. Un compteur d’autorités n’a de sens réel qu’au niveau réseau, pas dans une page de périmètre local. Deux issues à arbitrer : (a) retirer ce compteur de la page Biblioteca et le porter au niveau Rede ; (b) le redéfinir comme « autorités dont cette biblio détient au moins un ouvrage » (jointure authors vers book_authors vers holdings scopés). Décision de conception, pas un fix deux lignes. À noter : la ligne du frontend fait actuellement count(*) sur authors sans filtre, comportement intrinsèquement global tant que le schéma n’a pas de library_id sur authors.</w:t>
       </w:r>
     </w:p>
     <w:p>
@@ -14964,7 +14564,8 @@
         <w:spacing w:after="120"/>
       </w:pPr>
       <w:r>
-        <w:t xml:space="preserve">Émergé le 20/05 en réfléchissant au compteur AUTORIDADES. Dans un réseau fédéré, sans garde-fou, le catalogage accumule des doublons : trois notices Kropotkine, cinq fois « La Conquête du pain ». Besoin d’un outil de détection de proches-doublons par critères croisés, déclenché avant la validation d’une saisie : pour les documents (titre + auteur + année + ISBN/éditeur), pour les autorités (nom + dates). L’outil propose les entités proches déjà existantes et invite à les réutiliser plutôt qu’à re-saisir. Distinction structurante : documents et autorités sont des entités bibliographiques partagées, à dédupliquer ; les exemplaires, eux, se créent autant qu’il y en a physiquement recensés, jamais dédupliqués. Prérequis du chantier Catalogação à venir.</w:t>
+        <w:lastRenderedPageBreak/>
+        <w:t>Émergé le 20/05 en réfléchissant au compteur AUTORIDADES. Dans un réseau fédéré, sans garde-fou, le catalogage accumule des doublons : trois notices Kropotkine, cinq fois « La Conquête du pain ». Besoin d’un outil de détection de proches-doublons par critères croisés, déclenché avant la validation d’une saisie : pour les documents (titre + auteur + année + ISBN/éditeur), pour les autorités (nom + dates). L’outil propose les entités proches déjà existantes et invite à les réutiliser plutôt qu’à re-saisir. Distinction structurante : documents et autorités sont des entités bibliographiques partagées, à dédupliquer ; les exemplaires, eux, se créent autant qu’il y en a physiquement recensés, jamais dédupliqués. Prérequis du chantier Catalogação à venir.</w:t>
       </w:r>
     </w:p>
     <w:p>
@@ -14995,7 +14596,7 @@
         <w:spacing w:after="120"/>
       </w:pPr>
       <w:r>
-        <w:t xml:space="preserve">Constat du 20/05, après test de plusieurs flux mail. Les messages automatisés présentent une dette transverse qui ne se résout pas au cas par cas : il faut un chantier unique qui passe tous les contenus au peigne fin. Deux familles de problèmes repérées. (1) Harmonisation de forme : styles, présence ou absence de logos, mise en page inégale d’un flux à l’autre. (2) Pertinence et exactitude des contenus. Exemples concrets relevés : les comptes-rendus hebdomadaires (réseau et biblio) n’intègrent pas les données de consultations ; le mail d’annulation d’une consultation à l’initiative du lecteur est strictement identique côté lecteur (correct) et côté biblio (non conforme : un wording « cancelada por você » adressé à la biblio alors que ce n’est pas elle qui a annulé). Périmètre : recenser tous les events mail et leurs handlers, définir une grille de cohérence (logo, signature, ton relationnel vs technique, destinataire correct, complétude des données), corriger flux par flux. À cadrer comme un chantier dédié, distinct du chantier migration Resend #110 mais à coordonner avec lui (autant auditer les contenus pendant qu’on touche à la couche mail). Lien doctrinal : la distinction ton relationnel / ton technique et le routage par destinataire sont déjà posés dans les specs (cf. doctrines notifications consultas R7-R11, doctrine traçabilité coordination).</w:t>
+        <w:t>Constat du 20/05, après test de plusieurs flux mail. Les messages automatisés présentent une dette transverse qui ne se résout pas au cas par cas : il faut un chantier unique qui passe tous les contenus au peigne fin. Deux familles de problèmes repérées. (1) Harmonisation de forme : styles, présence ou absence de logos, mise en page inégale d’un flux à l’autre. (2) Pertinence et exactitude des contenus. Exemples concrets relevés : les comptes-rendus hebdomadaires (réseau et biblio) n’intègrent pas les données de consultations ; le mail d’annulation d’une consultation à l’initiative du lecteur est strictement identique côté lecteur (correct) et côté biblio (non conforme : un wording « cancelada por você » adressé à la biblio alors que ce n’est pas elle qui a annulé). Périmètre : recenser tous les events mail et leurs handlers, définir une grille de cohérence (logo, signature, ton relationnel vs technique, destinataire correct, complétude des données), corriger flux par flux. À cadrer comme un chantier dédié, distinct du chantier migration Resend #110 mais à coordonner avec lui (autant auditer les contenus pendant qu’on touche à la couche mail). Lien doctrinal : la distinction ton relationnel / ton technique et le routage par destinataire sont déjà posés dans les specs (cf. doctrines notifications consultas R7-R11, doctrine traçabilité coordination).</w:t>
       </w:r>
     </w:p>
     <w:p>
@@ -15087,7 +14688,9 @@
         <w:spacing w:after="120"/>
       </w:pPr>
       <w:r>
-        <w:t>Émergé le 21/05 en lisant le handler de notify-internal-task. L’Edge Function gère bien une branche task_invitation (kind = « task_invitation », avec un invite_id et un mail d’invitation construit par buildTaskInvitationEmail, envoyé à une adresse libre sans exiger que la personne soit déjà inscrite ou bibliothécaire) — la capacité d’envoi existe donc côté EF. Reste à confirmer le déclencheur en amont : un écran dans la page Painel permettant de saisir l’e-mail d’un·e participant·e, une table d’invitations (le invite_id le suggère), un webhook Postgres qui appelle l’EF. À vérifier de bout en bout ; rattaché à la réflexion page Painel / workflow tâches. Pas un sujet de la migration mail.</w:t>
+        <w:t xml:space="preserve">Émergé le 21/05 en lisant le handler de notify-internal-task. L’Edge Function gère bien une branche task_invitation (kind = « task_invitation », avec un invite_id et un mail d’invitation construit par buildTaskInvitationEmail, envoyé à une adresse libre sans exiger que la personne soit déjà inscrite ou bibliothécaire) — la capacité d’envoi existe donc côté EF. Reste à confirmer le déclencheur en amont : un écran dans la page Painel permettant de saisir l’e-mail d’un·e participant·e, une table </w:t>
+        <w:lastRenderedPageBreak/>
+        <w:t>d’invitations (le invite_id le suggère), un webhook Postgres qui appelle l’EF. À vérifier de bout en bout ; rattaché à la réflexion page Painel / workflow tâches. Pas un sujet de la migration mail.</w:t>
       </w:r>
     </w:p>
     <w:p>
@@ -15157,7 +14760,6 @@
         <w:pStyle w:val="Titre1"/>
       </w:pPr>
       <w:r>
-        <w:lastRenderedPageBreak/>
         <w:t>F. Séquencement recommandé</w:t>
       </w:r>
     </w:p>
@@ -15383,6 +14985,7 @@
         </w:numPr>
       </w:pPr>
       <w:r>
+        <w:lastRenderedPageBreak/>
         <w:t>#71 Coquille de.json (5 min)</w:t>
       </w:r>
     </w:p>
@@ -16558,7 +16161,7 @@
           <w:sz w:val="18"/>
           <w:szCs w:val="18"/>
         </w:rPr>
-        <w:t>— Fin du backlog v9 —</w:t>
+        <w:t>— Fin du backlog v11 —</w:t>
       </w:r>
     </w:p>
     <w:sectPr>

</xml_diff>